<commit_message>
feat: add CV files in DOCX and PDF formats to repository
</commit_message>
<xml_diff>
--- a/files/NOYAL SURYA J J_CV.docx
+++ b/files/NOYAL SURYA J J_CV.docx
@@ -134,18 +134,8 @@
           <w:sz w:val="48"/>
           <w:szCs w:val="52"/>
         </w:rPr>
-        <w:t xml:space="preserve">NOYAL SURYA J </w:t>
-      </w:r>
-      <w:proofErr w:type="spellStart"/>
-      <w:r>
-        <w:rPr>
-          <w:rFonts w:ascii="Inter 18pt SemiBold" w:hAnsi="Inter 18pt SemiBold" w:cstheme="majorHAnsi"/>
-          <w:sz w:val="48"/>
-          <w:szCs w:val="52"/>
-        </w:rPr>
-        <w:t>J</w:t>
-      </w:r>
-      <w:proofErr w:type="spellEnd"/>
+        <w:t>NOYAL SURYA J J</w:t>
+      </w:r>
     </w:p>
     <w:p>
       <w:pPr>
@@ -172,26 +162,98 @@
           <w:i w:val="0"/>
           <w:iCs w:val="0"/>
         </w:rPr>
-        <w:t>[Visit Visa]</w:t>
-      </w:r>
-    </w:p>
-    <w:p>
-      <w:pPr>
-        <w:rPr>
-          <w:rStyle w:val="SubtleEmphasis"/>
-          <w:rFonts w:ascii="Inter 18pt" w:hAnsi="Inter 18pt" w:cstheme="minorHAnsi"/>
-          <w:i w:val="0"/>
-          <w:iCs w:val="0"/>
-        </w:rPr>
-      </w:pPr>
-      <w:r>
-        <w:rPr>
-          <w:rStyle w:val="SubtleEmphasis"/>
-          <w:rFonts w:ascii="Inter 18pt" w:hAnsi="Inter 18pt" w:cstheme="minorHAnsi"/>
-          <w:i w:val="0"/>
-          <w:iCs w:val="0"/>
-        </w:rPr>
-        <w:t>suryanoyal@gmail.com | +971 505 655 798</w:t>
+        <w:t>(Visit</w:t>
+      </w:r>
+      <w:r>
+        <w:rPr>
+          <w:rStyle w:val="SubtleEmphasis"/>
+          <w:rFonts w:ascii="Inter 18pt" w:hAnsi="Inter 18pt" w:cstheme="minorHAnsi"/>
+          <w:i w:val="0"/>
+          <w:iCs w:val="0"/>
+        </w:rPr>
+        <w:t xml:space="preserve"> </w:t>
+      </w:r>
+      <w:r>
+        <w:rPr>
+          <w:rStyle w:val="SubtleEmphasis"/>
+          <w:rFonts w:ascii="Inter 18pt" w:hAnsi="Inter 18pt" w:cstheme="minorHAnsi"/>
+          <w:i w:val="0"/>
+          <w:iCs w:val="0"/>
+        </w:rPr>
+        <w:t>Visa</w:t>
+      </w:r>
+      <w:r>
+        <w:rPr>
+          <w:rStyle w:val="SubtleEmphasis"/>
+          <w:rFonts w:ascii="Inter 18pt" w:hAnsi="Inter 18pt" w:cstheme="minorHAnsi"/>
+          <w:i w:val="0"/>
+          <w:iCs w:val="0"/>
+        </w:rPr>
+        <w:t>)</w:t>
+      </w:r>
+    </w:p>
+    <w:p>
+      <w:pPr>
+        <w:rPr>
+          <w:rStyle w:val="SubtleEmphasis"/>
+          <w:rFonts w:ascii="Inter 18pt" w:hAnsi="Inter 18pt" w:cstheme="minorHAnsi"/>
+          <w:i w:val="0"/>
+          <w:iCs w:val="0"/>
+        </w:rPr>
+      </w:pPr>
+      <w:r>
+        <w:rPr>
+          <w:rStyle w:val="SubtleEmphasis"/>
+          <w:rFonts w:ascii="Inter 18pt" w:hAnsi="Inter 18pt" w:cstheme="minorHAnsi"/>
+          <w:i w:val="0"/>
+          <w:iCs w:val="0"/>
+        </w:rPr>
+        <w:t>suryanoyal@gmail.com | +971 50</w:t>
+      </w:r>
+      <w:r>
+        <w:rPr>
+          <w:rStyle w:val="SubtleEmphasis"/>
+          <w:rFonts w:ascii="Inter 18pt" w:hAnsi="Inter 18pt" w:cstheme="minorHAnsi"/>
+          <w:i w:val="0"/>
+          <w:iCs w:val="0"/>
+        </w:rPr>
+        <w:t>4</w:t>
+      </w:r>
+      <w:r>
+        <w:rPr>
+          <w:rStyle w:val="SubtleEmphasis"/>
+          <w:rFonts w:ascii="Inter 18pt" w:hAnsi="Inter 18pt" w:cstheme="minorHAnsi"/>
+          <w:i w:val="0"/>
+          <w:iCs w:val="0"/>
+        </w:rPr>
+        <w:t xml:space="preserve"> </w:t>
+      </w:r>
+      <w:r>
+        <w:rPr>
+          <w:rStyle w:val="SubtleEmphasis"/>
+          <w:rFonts w:ascii="Inter 18pt" w:hAnsi="Inter 18pt" w:cstheme="minorHAnsi"/>
+          <w:i w:val="0"/>
+          <w:iCs w:val="0"/>
+        </w:rPr>
+        <w:t>123</w:t>
+      </w:r>
+      <w:r>
+        <w:rPr>
+          <w:rStyle w:val="SubtleEmphasis"/>
+          <w:rFonts w:ascii="Inter 18pt" w:hAnsi="Inter 18pt" w:cstheme="minorHAnsi"/>
+          <w:i w:val="0"/>
+          <w:iCs w:val="0"/>
+        </w:rPr>
+        <w:t xml:space="preserve"> </w:t>
+      </w:r>
+      <w:r>
+        <w:rPr>
+          <w:rStyle w:val="SubtleEmphasis"/>
+          <w:rFonts w:ascii="Inter 18pt" w:hAnsi="Inter 18pt" w:cstheme="minorHAnsi"/>
+          <w:i w:val="0"/>
+          <w:iCs w:val="0"/>
+        </w:rPr>
+        <w:t>644</w:t>
       </w:r>
     </w:p>
     <w:p>
@@ -209,17 +271,8 @@
             <w:rStyle w:val="Hyperlink"/>
             <w:rFonts w:ascii="Inter 18pt" w:hAnsi="Inter 18pt" w:cstheme="minorHAnsi"/>
           </w:rPr>
-          <w:t>linkedin.com/in/</w:t>
+          <w:t>linkedin.com/in/surya-noyal</w:t>
         </w:r>
-        <w:proofErr w:type="spellStart"/>
-        <w:r>
-          <w:rPr>
-            <w:rStyle w:val="Hyperlink"/>
-            <w:rFonts w:ascii="Inter 18pt" w:hAnsi="Inter 18pt" w:cstheme="minorHAnsi"/>
-          </w:rPr>
-          <w:t>surya-noyal</w:t>
-        </w:r>
-        <w:proofErr w:type="spellEnd"/>
       </w:hyperlink>
       <w:r>
         <w:rPr>
@@ -291,190 +344,113 @@
       </w:r>
     </w:p>
     <w:p>
-      <w:r>
-        <w:rPr>
-          <w:rStyle w:val="SubtleEmphasis"/>
-          <w:rFonts w:ascii="Inter 18pt" w:hAnsi="Inter 18pt" w:cstheme="minorHAnsi"/>
-          <w:b/>
-          <w:bCs/>
-          <w:i w:val="0"/>
-          <w:iCs w:val="0"/>
-        </w:rPr>
-        <w:t>Creative Content creator and videographer</w:t>
-      </w:r>
-      <w:r>
-        <w:rPr>
-          <w:rStyle w:val="SubtleEmphasis"/>
-          <w:rFonts w:ascii="Inter 18pt" w:hAnsi="Inter 18pt" w:cstheme="minorHAnsi"/>
-          <w:i w:val="0"/>
-          <w:iCs w:val="0"/>
-        </w:rPr>
-        <w:t xml:space="preserve"> with </w:t>
-      </w:r>
-      <w:r>
-        <w:rPr>
-          <w:rStyle w:val="SubtleEmphasis"/>
-          <w:rFonts w:ascii="Inter 18pt" w:hAnsi="Inter 18pt" w:cstheme="minorHAnsi"/>
-          <w:b/>
-          <w:bCs/>
-          <w:i w:val="0"/>
-          <w:iCs w:val="0"/>
-        </w:rPr>
-        <w:t>more than four years of experience</w:t>
-      </w:r>
-      <w:r>
-        <w:rPr>
-          <w:rStyle w:val="SubtleEmphasis"/>
-          <w:rFonts w:ascii="Inter 18pt" w:hAnsi="Inter 18pt" w:cstheme="minorHAnsi"/>
-          <w:i w:val="0"/>
-          <w:iCs w:val="0"/>
-        </w:rPr>
-        <w:t xml:space="preserve"> making short-form content for </w:t>
-      </w:r>
-      <w:r>
-        <w:rPr>
-          <w:rStyle w:val="SubtleEmphasis"/>
-          <w:rFonts w:ascii="Inter 18pt" w:hAnsi="Inter 18pt" w:cstheme="minorHAnsi"/>
-          <w:b/>
-          <w:bCs/>
-          <w:i w:val="0"/>
-          <w:iCs w:val="0"/>
-        </w:rPr>
-        <w:t>influencers and brands</w:t>
-      </w:r>
-      <w:r>
-        <w:rPr>
-          <w:rStyle w:val="SubtleEmphasis"/>
-          <w:rFonts w:ascii="Inter 18pt" w:hAnsi="Inter 18pt" w:cstheme="minorHAnsi"/>
-          <w:i w:val="0"/>
-          <w:iCs w:val="0"/>
-        </w:rPr>
-        <w:t xml:space="preserve"> in </w:t>
-      </w:r>
-      <w:r>
-        <w:rPr>
-          <w:rStyle w:val="SubtleEmphasis"/>
-          <w:rFonts w:ascii="Inter 18pt" w:hAnsi="Inter 18pt" w:cstheme="minorHAnsi"/>
-          <w:b/>
-          <w:bCs/>
-          <w:i w:val="0"/>
-          <w:iCs w:val="0"/>
-        </w:rPr>
-        <w:t>the lifestyle, entertainment, and personal branding fields.</w:t>
-      </w:r>
-      <w:r>
-        <w:rPr>
-          <w:rStyle w:val="SubtleEmphasis"/>
-          <w:rFonts w:ascii="Inter 18pt" w:hAnsi="Inter 18pt" w:cstheme="minorHAnsi"/>
-          <w:i w:val="0"/>
-          <w:iCs w:val="0"/>
-        </w:rPr>
-        <w:t xml:space="preserve"> Used </w:t>
-      </w:r>
-      <w:r>
-        <w:rPr>
-          <w:rStyle w:val="SubtleEmphasis"/>
-          <w:rFonts w:ascii="Inter 18pt" w:hAnsi="Inter 18pt" w:cstheme="minorHAnsi"/>
-          <w:b/>
-          <w:bCs/>
-          <w:i w:val="0"/>
-          <w:iCs w:val="0"/>
-        </w:rPr>
-        <w:t>data-driven storytelling, creative direction, filming, and editing</w:t>
-      </w:r>
-      <w:r>
-        <w:rPr>
-          <w:rStyle w:val="SubtleEmphasis"/>
-          <w:rFonts w:ascii="Inter 18pt" w:hAnsi="Inter 18pt" w:cstheme="minorHAnsi"/>
-          <w:i w:val="0"/>
-          <w:iCs w:val="0"/>
-        </w:rPr>
-        <w:t xml:space="preserve"> to get </w:t>
-      </w:r>
-      <w:r>
-        <w:rPr>
-          <w:rStyle w:val="SubtleEmphasis"/>
-          <w:rFonts w:ascii="Inter 18pt" w:hAnsi="Inter 18pt" w:cstheme="minorHAnsi"/>
-          <w:b/>
-          <w:bCs/>
-          <w:i w:val="0"/>
-          <w:iCs w:val="0"/>
-        </w:rPr>
-        <w:t xml:space="preserve">22 million </w:t>
-      </w:r>
-      <w:r>
-        <w:rPr>
-          <w:rStyle w:val="SubtleEmphasis"/>
-          <w:rFonts w:ascii="Inter 18pt" w:hAnsi="Inter 18pt" w:cstheme="minorHAnsi"/>
-          <w:b/>
-          <w:bCs/>
-          <w:i w:val="0"/>
-          <w:iCs w:val="0"/>
-        </w:rPr>
-        <w:t>and</w:t>
-      </w:r>
-      <w:r>
-        <w:rPr>
-          <w:rStyle w:val="SubtleEmphasis"/>
-          <w:rFonts w:ascii="Inter 18pt" w:hAnsi="Inter 18pt" w:cstheme="minorHAnsi"/>
-          <w:b/>
-          <w:bCs/>
-          <w:i w:val="0"/>
-          <w:iCs w:val="0"/>
-        </w:rPr>
-        <w:t xml:space="preserve"> more organic views.</w:t>
-      </w:r>
-      <w:r>
-        <w:rPr>
-          <w:rStyle w:val="SubtleEmphasis"/>
-          <w:rFonts w:ascii="Inter 18pt" w:hAnsi="Inter 18pt" w:cstheme="minorHAnsi"/>
-          <w:i w:val="0"/>
-          <w:iCs w:val="0"/>
-        </w:rPr>
-        <w:t xml:space="preserve"> Skilled in building </w:t>
-      </w:r>
-      <w:r>
-        <w:rPr>
-          <w:rStyle w:val="SubtleEmphasis"/>
-          <w:rFonts w:ascii="Inter 18pt" w:hAnsi="Inter 18pt" w:cstheme="minorHAnsi"/>
-          <w:b/>
-          <w:bCs/>
-          <w:i w:val="0"/>
-          <w:iCs w:val="0"/>
-        </w:rPr>
-        <w:t>performance-focused content</w:t>
-      </w:r>
-      <w:r>
-        <w:rPr>
-          <w:rStyle w:val="SubtleEmphasis"/>
-          <w:rFonts w:ascii="Inter 18pt" w:hAnsi="Inter 18pt" w:cstheme="minorHAnsi"/>
-          <w:i w:val="0"/>
-          <w:iCs w:val="0"/>
-        </w:rPr>
-        <w:t xml:space="preserve"> that increases </w:t>
-      </w:r>
-      <w:r>
-        <w:rPr>
-          <w:rStyle w:val="SubtleEmphasis"/>
-          <w:rFonts w:ascii="Inter 18pt" w:hAnsi="Inter 18pt" w:cstheme="minorHAnsi"/>
-          <w:b/>
-          <w:bCs/>
-          <w:i w:val="0"/>
-          <w:iCs w:val="0"/>
-        </w:rPr>
-        <w:t>reach, engagement, and audience retention</w:t>
-      </w:r>
-      <w:r>
-        <w:rPr>
-          <w:rStyle w:val="SubtleEmphasis"/>
-          <w:rFonts w:ascii="Inter 18pt" w:hAnsi="Inter 18pt" w:cstheme="minorHAnsi"/>
-          <w:i w:val="0"/>
-          <w:iCs w:val="0"/>
-        </w:rPr>
-        <w:t xml:space="preserve"> across Instagram and digital platforms</w:t>
-      </w:r>
-      <w:r>
-        <w:t>.</w:t>
+      <w:pPr>
+        <w:pStyle w:val="Heading1"/>
+        <w:spacing w:line="276" w:lineRule="auto"/>
+        <w:rPr>
+          <w:rStyle w:val="SubtleEmphasis"/>
+          <w:rFonts w:ascii="Inter 18pt" w:eastAsiaTheme="minorHAnsi" w:hAnsi="Inter 18pt" w:cstheme="minorHAnsi"/>
+          <w:i w:val="0"/>
+          <w:iCs w:val="0"/>
+          <w:sz w:val="22"/>
+          <w:szCs w:val="28"/>
+        </w:rPr>
+      </w:pPr>
+      <w:r>
+        <w:rPr>
+          <w:rStyle w:val="SubtleEmphasis"/>
+          <w:rFonts w:ascii="Inter 18pt" w:eastAsiaTheme="minorHAnsi" w:hAnsi="Inter 18pt" w:cstheme="minorHAnsi"/>
+          <w:b/>
+          <w:bCs/>
+          <w:i w:val="0"/>
+          <w:iCs w:val="0"/>
+          <w:sz w:val="22"/>
+          <w:szCs w:val="28"/>
+        </w:rPr>
+        <w:t>Creative Content Creator &amp; Videographer</w:t>
+      </w:r>
+      <w:r>
+        <w:rPr>
+          <w:rStyle w:val="SubtleEmphasis"/>
+          <w:rFonts w:ascii="Inter 18pt" w:eastAsiaTheme="minorHAnsi" w:hAnsi="Inter 18pt" w:cstheme="minorHAnsi"/>
+          <w:i w:val="0"/>
+          <w:iCs w:val="0"/>
+          <w:sz w:val="22"/>
+          <w:szCs w:val="28"/>
+        </w:rPr>
+        <w:t xml:space="preserve"> with</w:t>
+      </w:r>
+      <w:r>
+        <w:rPr>
+          <w:rStyle w:val="SubtleEmphasis"/>
+          <w:rFonts w:ascii="Inter 18pt" w:eastAsiaTheme="minorHAnsi" w:hAnsi="Inter 18pt" w:cstheme="minorHAnsi"/>
+          <w:b/>
+          <w:bCs/>
+          <w:i w:val="0"/>
+          <w:iCs w:val="0"/>
+          <w:sz w:val="22"/>
+          <w:szCs w:val="28"/>
+        </w:rPr>
+        <w:t xml:space="preserve"> 4+ years of experience in short-form content strategy for lifestyle, entertainment, and personal branding industries. </w:t>
+      </w:r>
+      <w:r>
+        <w:rPr>
+          <w:rStyle w:val="SubtleEmphasis"/>
+          <w:rFonts w:ascii="Inter 18pt" w:eastAsiaTheme="minorHAnsi" w:hAnsi="Inter 18pt" w:cstheme="minorHAnsi"/>
+          <w:i w:val="0"/>
+          <w:iCs w:val="0"/>
+          <w:sz w:val="22"/>
+          <w:szCs w:val="28"/>
+        </w:rPr>
+        <w:t>Proven track record in driving</w:t>
+      </w:r>
+      <w:r>
+        <w:rPr>
+          <w:rStyle w:val="SubtleEmphasis"/>
+          <w:rFonts w:ascii="Inter 18pt" w:eastAsiaTheme="minorHAnsi" w:hAnsi="Inter 18pt" w:cstheme="minorHAnsi"/>
+          <w:b/>
+          <w:bCs/>
+          <w:i w:val="0"/>
+          <w:iCs w:val="0"/>
+          <w:sz w:val="22"/>
+          <w:szCs w:val="28"/>
+        </w:rPr>
+        <w:t xml:space="preserve"> 22M+ organic views and growing social accounts to 107K+ </w:t>
+      </w:r>
+      <w:r>
+        <w:rPr>
+          <w:rStyle w:val="SubtleEmphasis"/>
+          <w:rFonts w:ascii="Inter 18pt" w:eastAsiaTheme="minorHAnsi" w:hAnsi="Inter 18pt" w:cstheme="minorHAnsi"/>
+          <w:i w:val="0"/>
+          <w:iCs w:val="0"/>
+          <w:sz w:val="22"/>
+          <w:szCs w:val="28"/>
+        </w:rPr>
+        <w:t>followers by leveraging data driven storytelling, retention-focused editing, and trend-based scripting.</w:t>
+      </w:r>
+      <w:r>
+        <w:rPr>
+          <w:rStyle w:val="SubtleEmphasis"/>
+          <w:rFonts w:ascii="Inter 18pt" w:eastAsiaTheme="minorHAnsi" w:hAnsi="Inter 18pt" w:cstheme="minorHAnsi"/>
+          <w:b/>
+          <w:bCs/>
+          <w:i w:val="0"/>
+          <w:iCs w:val="0"/>
+          <w:sz w:val="22"/>
+          <w:szCs w:val="28"/>
+        </w:rPr>
+        <w:t xml:space="preserve"> Skilled in Adobe Creative Cloud (Premiere Pro, After Effects), social media analytics (Meta Business Suite, Instagram Insights), and creative direction</w:t>
+      </w:r>
+      <w:r>
+        <w:rPr>
+          <w:rStyle w:val="SubtleEmphasis"/>
+          <w:rFonts w:ascii="Inter 18pt" w:eastAsiaTheme="minorHAnsi" w:hAnsi="Inter 18pt" w:cstheme="minorHAnsi"/>
+          <w:i w:val="0"/>
+          <w:iCs w:val="0"/>
+          <w:sz w:val="22"/>
+          <w:szCs w:val="28"/>
+        </w:rPr>
+        <w:t>, known for optimizing engagement through 1-2s hooks and viral content frameworks.</w:t>
       </w:r>
     </w:p>
     <w:p>
@@ -919,7 +895,25 @@
           <w:i w:val="0"/>
           <w:iCs w:val="0"/>
         </w:rPr>
-        <w:t>Client Management, Account Management, Digital Marketing, Product Marketing, Market Research, Strategic Planning, Presentation &amp; Pitching, Team Leadership, Project Coordination, Stakeholder Communication</w:t>
+        <w:t xml:space="preserve">Client Management, Account Management, Digital Marketing, Product Marketing, Market Research, Strategic Planning, Presentation &amp; Pitching, Team Leadership, </w:t>
+      </w:r>
+      <w:r>
+        <w:rPr>
+          <w:rStyle w:val="SubtleEmphasis"/>
+          <w:rFonts w:ascii="Inter 18pt" w:hAnsi="Inter 18pt" w:cstheme="minorHAnsi"/>
+          <w:i w:val="0"/>
+          <w:iCs w:val="0"/>
+        </w:rPr>
+        <w:t>-</w:t>
+      </w:r>
+      <w:r>
+        <w:rPr>
+          <w:rStyle w:val="SubtleEmphasis"/>
+          <w:rFonts w:ascii="Inter 18pt" w:hAnsi="Inter 18pt" w:cstheme="minorHAnsi"/>
+          <w:i w:val="0"/>
+          <w:iCs w:val="0"/>
+        </w:rPr>
+        <w:t>Project Coordination, Stakeholder Communication</w:t>
       </w:r>
     </w:p>
     <w:p>
@@ -976,172 +970,30 @@
           <w:i w:val="0"/>
           <w:iCs w:val="0"/>
         </w:rPr>
-        <w:t>Social Media Growth Manager &amp; Creative Strategist (</w:t>
-      </w:r>
-      <w:proofErr w:type="gramStart"/>
-      <w:r>
-        <w:rPr>
-          <w:rStyle w:val="SubtleEmphasis"/>
-          <w:rFonts w:ascii="Inter 18pt" w:hAnsi="Inter 18pt" w:cstheme="minorHAnsi"/>
-          <w:b/>
-          <w:bCs/>
-          <w:i w:val="0"/>
-          <w:iCs w:val="0"/>
-        </w:rPr>
-        <w:t xml:space="preserve">Freelance)  </w:t>
-      </w:r>
-      <w:r>
-        <w:rPr>
-          <w:rStyle w:val="SubtleEmphasis"/>
-          <w:rFonts w:ascii="Inter 18pt" w:hAnsi="Inter 18pt" w:cstheme="minorHAnsi"/>
-          <w:b/>
-          <w:bCs/>
-          <w:i w:val="0"/>
-          <w:iCs w:val="0"/>
-        </w:rPr>
-        <w:t xml:space="preserve"> </w:t>
-      </w:r>
-      <w:proofErr w:type="gramEnd"/>
-      <w:r>
-        <w:rPr>
-          <w:rStyle w:val="SubtleEmphasis"/>
-          <w:rFonts w:ascii="Inter 18pt" w:hAnsi="Inter 18pt" w:cstheme="minorHAnsi"/>
-          <w:b/>
-          <w:bCs/>
-          <w:i w:val="0"/>
-          <w:iCs w:val="0"/>
-        </w:rPr>
-        <w:t xml:space="preserve">    </w:t>
-      </w:r>
-      <w:r>
-        <w:rPr>
-          <w:rStyle w:val="SubtleEmphasis"/>
-          <w:rFonts w:ascii="Inter 18pt" w:hAnsi="Inter 18pt" w:cstheme="minorHAnsi"/>
-          <w:b/>
-          <w:bCs/>
-          <w:i w:val="0"/>
-          <w:iCs w:val="0"/>
-        </w:rPr>
-        <w:t xml:space="preserve">   </w:t>
-      </w:r>
-      <w:r>
-        <w:rPr>
-          <w:rStyle w:val="SubtleEmphasis"/>
-          <w:rFonts w:ascii="Inter 18pt" w:hAnsi="Inter 18pt" w:cstheme="minorHAnsi"/>
-          <w:b/>
-          <w:bCs/>
-          <w:i w:val="0"/>
-          <w:iCs w:val="0"/>
-        </w:rPr>
-        <w:t xml:space="preserve">                               2022 - Present</w:t>
-      </w:r>
-    </w:p>
-    <w:p>
-      <w:pPr>
-        <w:spacing w:line="276" w:lineRule="auto"/>
-        <w:ind w:right="-24"/>
-        <w:rPr>
-          <w:rStyle w:val="SubtleEmphasis"/>
-          <w:rFonts w:ascii="Inter 18pt" w:hAnsi="Inter 18pt" w:cstheme="minorHAnsi"/>
-          <w:b/>
-          <w:bCs/>
-          <w:i w:val="0"/>
-          <w:iCs w:val="0"/>
-        </w:rPr>
-      </w:pPr>
-      <w:r>
-        <w:rPr>
-          <w:rStyle w:val="SubtleEmphasis"/>
-          <w:rFonts w:ascii="Inter 18pt" w:hAnsi="Inter 18pt" w:cstheme="minorHAnsi"/>
-          <w:i w:val="0"/>
-          <w:iCs w:val="0"/>
-        </w:rPr>
-        <w:t>C</w:t>
-      </w:r>
-      <w:r>
-        <w:rPr>
-          <w:rStyle w:val="SubtleEmphasis"/>
-          <w:rFonts w:ascii="Inter 18pt" w:hAnsi="Inter 18pt" w:cstheme="minorHAnsi"/>
-          <w:i w:val="0"/>
-          <w:iCs w:val="0"/>
-        </w:rPr>
-        <w:t xml:space="preserve">reated high-performing </w:t>
-      </w:r>
-      <w:r>
-        <w:rPr>
-          <w:rStyle w:val="SubtleEmphasis"/>
-          <w:rFonts w:ascii="Inter 18pt" w:hAnsi="Inter 18pt" w:cstheme="minorHAnsi"/>
-          <w:b/>
-          <w:bCs/>
-          <w:i w:val="0"/>
-          <w:iCs w:val="0"/>
-        </w:rPr>
-        <w:t>digital content and scalable growth systems</w:t>
-      </w:r>
-      <w:r>
-        <w:rPr>
-          <w:rStyle w:val="SubtleEmphasis"/>
-          <w:rFonts w:ascii="Inter 18pt" w:hAnsi="Inter 18pt" w:cstheme="minorHAnsi"/>
-          <w:i w:val="0"/>
-          <w:iCs w:val="0"/>
-        </w:rPr>
-        <w:t xml:space="preserve"> by collaborating with </w:t>
-      </w:r>
-      <w:r>
-        <w:rPr>
-          <w:rStyle w:val="SubtleEmphasis"/>
-          <w:rFonts w:ascii="Inter 18pt" w:hAnsi="Inter 18pt" w:cstheme="minorHAnsi"/>
-          <w:b/>
-          <w:bCs/>
-          <w:i w:val="0"/>
-          <w:iCs w:val="0"/>
-        </w:rPr>
-        <w:t>influencers, agencies, and brands</w:t>
-      </w:r>
-      <w:r>
-        <w:rPr>
-          <w:rStyle w:val="SubtleEmphasis"/>
-          <w:rFonts w:ascii="Inter 18pt" w:hAnsi="Inter 18pt" w:cstheme="minorHAnsi"/>
-          <w:i w:val="0"/>
-          <w:iCs w:val="0"/>
-        </w:rPr>
-        <w:t xml:space="preserve"> in the entertainment, </w:t>
-      </w:r>
-      <w:r>
-        <w:rPr>
-          <w:rStyle w:val="SubtleEmphasis"/>
-          <w:rFonts w:ascii="Inter 18pt" w:hAnsi="Inter 18pt" w:cstheme="minorHAnsi"/>
-          <w:b/>
-          <w:bCs/>
-          <w:i w:val="0"/>
-          <w:iCs w:val="0"/>
-        </w:rPr>
-        <w:t>lifestyle, education, and personal branding sectors.</w:t>
-      </w:r>
-    </w:p>
-    <w:p>
-      <w:pPr>
-        <w:spacing w:line="276" w:lineRule="auto"/>
-        <w:ind w:right="118"/>
-        <w:rPr>
-          <w:rStyle w:val="SubtleEmphasis"/>
-          <w:rFonts w:ascii="Inter 18pt" w:hAnsi="Inter 18pt" w:cstheme="minorHAnsi"/>
-          <w:b/>
-          <w:bCs/>
-          <w:i w:val="0"/>
-          <w:iCs w:val="0"/>
-        </w:rPr>
-      </w:pPr>
-      <w:r>
-        <w:rPr>
-          <w:rStyle w:val="SubtleEmphasis"/>
-          <w:rFonts w:ascii="Inter 18pt" w:hAnsi="Inter 18pt" w:cstheme="minorHAnsi"/>
-          <w:b/>
-          <w:bCs/>
-          <w:i w:val="0"/>
-          <w:iCs w:val="0"/>
-        </w:rPr>
-        <w:t>Achievements:</w:t>
+        <w:t>Content Creator – Urban Class Properties [UAE – Dubai]</w:t>
+      </w:r>
+      <w:r>
+        <w:rPr>
+          <w:rStyle w:val="SubtleEmphasis"/>
+          <w:rFonts w:ascii="Inter 18pt" w:hAnsi="Inter 18pt" w:cstheme="minorHAnsi"/>
+          <w:b/>
+          <w:bCs/>
+          <w:i w:val="0"/>
+          <w:iCs w:val="0"/>
+        </w:rPr>
+        <w:tab/>
+      </w:r>
+      <w:r>
+        <w:rPr>
+          <w:rStyle w:val="SubtleEmphasis"/>
+          <w:rFonts w:ascii="Inter 18pt" w:hAnsi="Inter 18pt" w:cstheme="minorHAnsi"/>
+          <w:b/>
+          <w:bCs/>
+          <w:i w:val="0"/>
+          <w:iCs w:val="0"/>
+        </w:rPr>
+        <w:tab/>
+        <w:t xml:space="preserve">        February 2026 - Present</w:t>
       </w:r>
     </w:p>
     <w:p>
@@ -1149,32 +1001,19 @@
         <w:pStyle w:val="ListParagraph"/>
         <w:numPr>
           <w:ilvl w:val="0"/>
-          <w:numId w:val="11"/>
+          <w:numId w:val="22"/>
         </w:numPr>
-        <w:spacing w:line="276" w:lineRule="auto"/>
-        <w:ind w:right="118"/>
-        <w:rPr>
-          <w:rFonts w:ascii="Inter 18pt" w:hAnsi="Inter 18pt" w:cstheme="minorHAnsi"/>
-          <w:b/>
-          <w:bCs/>
-          <w:color w:val="404040" w:themeColor="text1" w:themeTint="BF"/>
-        </w:rPr>
-      </w:pPr>
-      <w:r>
-        <w:rPr>
-          <w:rFonts w:ascii="Inter 18pt" w:hAnsi="Inter 18pt" w:cstheme="minorHAnsi"/>
-          <w:color w:val="404040" w:themeColor="text1" w:themeTint="BF"/>
-        </w:rPr>
-        <w:t xml:space="preserve">Viral short-form content generated over </w:t>
-      </w:r>
-      <w:r>
-        <w:rPr>
-          <w:rFonts w:ascii="Inter 18pt" w:hAnsi="Inter 18pt" w:cstheme="minorHAnsi"/>
-          <w:b/>
-          <w:bCs/>
-          <w:color w:val="404040" w:themeColor="text1" w:themeTint="BF"/>
-        </w:rPr>
-        <w:t>22 million organic views.</w:t>
+        <w:rPr>
+          <w:rFonts w:ascii="Inter 18pt" w:hAnsi="Inter 18pt" w:cstheme="minorHAnsi"/>
+          <w:color w:val="404040" w:themeColor="text1" w:themeTint="BF"/>
+        </w:rPr>
+      </w:pPr>
+      <w:r>
+        <w:rPr>
+          <w:rFonts w:ascii="Inter 18pt" w:hAnsi="Inter 18pt" w:cstheme="minorHAnsi"/>
+          <w:color w:val="404040" w:themeColor="text1" w:themeTint="BF"/>
+        </w:rPr>
+        <w:t xml:space="preserve">Produce end-to-end social content for property listings, developments, and brand campaigns across Instagram and YouTube, managing scripting, filming, editing, and publishing in-house. </w:t>
       </w:r>
     </w:p>
     <w:p>
@@ -1182,55 +1021,19 @@
         <w:pStyle w:val="ListParagraph"/>
         <w:numPr>
           <w:ilvl w:val="0"/>
-          <w:numId w:val="11"/>
+          <w:numId w:val="22"/>
         </w:numPr>
-        <w:spacing w:line="276" w:lineRule="auto"/>
-        <w:ind w:right="118"/>
-        <w:rPr>
-          <w:rFonts w:ascii="Inter 18pt" w:hAnsi="Inter 18pt" w:cstheme="minorHAnsi"/>
-          <w:color w:val="404040" w:themeColor="text1" w:themeTint="BF"/>
-        </w:rPr>
-      </w:pPr>
-      <w:r>
-        <w:rPr>
-          <w:rFonts w:ascii="Inter 18pt" w:hAnsi="Inter 18pt" w:cstheme="minorHAnsi"/>
-          <w:color w:val="404040" w:themeColor="text1" w:themeTint="BF"/>
-        </w:rPr>
-        <w:t xml:space="preserve">Created </w:t>
-      </w:r>
-      <w:r>
-        <w:rPr>
-          <w:rFonts w:ascii="Inter 18pt" w:hAnsi="Inter 18pt" w:cstheme="minorHAnsi"/>
-          <w:b/>
-          <w:bCs/>
-          <w:color w:val="404040" w:themeColor="text1" w:themeTint="BF"/>
-        </w:rPr>
-        <w:t>100+ performance-focused videos</w:t>
-      </w:r>
-      <w:r>
-        <w:rPr>
-          <w:rFonts w:ascii="Inter 18pt" w:hAnsi="Inter 18pt" w:cstheme="minorHAnsi"/>
-          <w:color w:val="404040" w:themeColor="text1" w:themeTint="BF"/>
-        </w:rPr>
-        <w:t xml:space="preserve"> between </w:t>
-      </w:r>
-      <w:r>
-        <w:rPr>
-          <w:rFonts w:ascii="Inter 18pt" w:hAnsi="Inter 18pt" w:cstheme="minorHAnsi"/>
-          <w:b/>
-          <w:bCs/>
-          <w:color w:val="404040" w:themeColor="text1" w:themeTint="BF"/>
-        </w:rPr>
-        <w:t>2022–2025.</w:t>
-      </w:r>
-      <w:r>
-        <w:rPr>
-          <w:rFonts w:ascii="Inter 18pt" w:hAnsi="Inter 18pt" w:cstheme="minorHAnsi"/>
-          <w:b/>
-          <w:bCs/>
-          <w:color w:val="404040" w:themeColor="text1" w:themeTint="BF"/>
-        </w:rPr>
-        <w:t xml:space="preserve"> </w:t>
+        <w:rPr>
+          <w:rFonts w:ascii="Inter 18pt" w:hAnsi="Inter 18pt" w:cstheme="minorHAnsi"/>
+          <w:color w:val="404040" w:themeColor="text1" w:themeTint="BF"/>
+        </w:rPr>
+      </w:pPr>
+      <w:r>
+        <w:rPr>
+          <w:rFonts w:ascii="Inter 18pt" w:hAnsi="Inter 18pt" w:cstheme="minorHAnsi"/>
+          <w:color w:val="404040" w:themeColor="text1" w:themeTint="BF"/>
+        </w:rPr>
+        <w:t xml:space="preserve">Translate property features and market positioning into compelling short-form narratives that drive organic reach and qualified lead interest. </w:t>
       </w:r>
     </w:p>
     <w:p>
@@ -1238,64 +1041,19 @@
         <w:pStyle w:val="ListParagraph"/>
         <w:numPr>
           <w:ilvl w:val="0"/>
-          <w:numId w:val="11"/>
+          <w:numId w:val="22"/>
         </w:numPr>
-        <w:spacing w:line="276" w:lineRule="auto"/>
-        <w:ind w:right="118"/>
-        <w:rPr>
-          <w:rFonts w:ascii="Inter 18pt" w:hAnsi="Inter 18pt" w:cstheme="minorHAnsi"/>
-          <w:color w:val="404040" w:themeColor="text1" w:themeTint="BF"/>
-        </w:rPr>
-      </w:pPr>
-      <w:r>
-        <w:rPr>
-          <w:rFonts w:ascii="Inter 18pt" w:hAnsi="Inter 18pt" w:cstheme="minorHAnsi"/>
-          <w:color w:val="404040" w:themeColor="text1" w:themeTint="BF"/>
-        </w:rPr>
-        <w:t xml:space="preserve">Developed content systems that increase engagement by </w:t>
-      </w:r>
-      <w:r>
-        <w:rPr>
-          <w:rFonts w:ascii="Inter 18pt" w:hAnsi="Inter 18pt" w:cstheme="minorHAnsi"/>
-          <w:b/>
-          <w:bCs/>
-          <w:color w:val="404040" w:themeColor="text1" w:themeTint="BF"/>
-        </w:rPr>
-        <w:t>300% to 800%</w:t>
-      </w:r>
-      <w:r>
-        <w:rPr>
-          <w:rFonts w:ascii="Inter 18pt" w:hAnsi="Inter 18pt" w:cstheme="minorHAnsi"/>
-          <w:b/>
-          <w:bCs/>
-          <w:color w:val="404040" w:themeColor="text1" w:themeTint="BF"/>
-        </w:rPr>
-        <w:t xml:space="preserve"> </w:t>
-      </w:r>
-      <w:r>
-        <w:rPr>
-          <w:rFonts w:ascii="Inter 18pt" w:hAnsi="Inter 18pt" w:cstheme="minorHAnsi"/>
-          <w:color w:val="404040" w:themeColor="text1" w:themeTint="BF"/>
-        </w:rPr>
-        <w:t>within</w:t>
-      </w:r>
-      <w:r>
-        <w:rPr>
-          <w:rFonts w:ascii="Inter 18pt" w:hAnsi="Inter 18pt" w:cstheme="minorHAnsi"/>
-          <w:b/>
-          <w:bCs/>
-          <w:color w:val="404040" w:themeColor="text1" w:themeTint="BF"/>
-        </w:rPr>
-        <w:t xml:space="preserve"> 6 months</w:t>
-      </w:r>
-      <w:r>
-        <w:rPr>
-          <w:rFonts w:ascii="Inter 18pt" w:hAnsi="Inter 18pt" w:cstheme="minorHAnsi"/>
-          <w:b/>
-          <w:bCs/>
-          <w:color w:val="404040" w:themeColor="text1" w:themeTint="BF"/>
-        </w:rPr>
-        <w:t>.</w:t>
+        <w:rPr>
+          <w:rFonts w:ascii="Inter 18pt" w:hAnsi="Inter 18pt" w:cstheme="minorHAnsi"/>
+          <w:color w:val="404040" w:themeColor="text1" w:themeTint="BF"/>
+        </w:rPr>
+      </w:pPr>
+      <w:r>
+        <w:rPr>
+          <w:rFonts w:ascii="Inter 18pt" w:hAnsi="Inter 18pt" w:cstheme="minorHAnsi"/>
+          <w:color w:val="404040" w:themeColor="text1" w:themeTint="BF"/>
+        </w:rPr>
+        <w:t xml:space="preserve">Collaborate directly with sales and marketing teams to align content calendars with listing launches, open days, and campaign pushes. </w:t>
       </w:r>
     </w:p>
     <w:p>
@@ -1303,37 +1061,19 @@
         <w:pStyle w:val="ListParagraph"/>
         <w:numPr>
           <w:ilvl w:val="0"/>
-          <w:numId w:val="11"/>
+          <w:numId w:val="22"/>
         </w:numPr>
-        <w:spacing w:line="276" w:lineRule="auto"/>
-        <w:ind w:right="118"/>
-        <w:rPr>
-          <w:rFonts w:ascii="Inter 18pt" w:hAnsi="Inter 18pt" w:cstheme="minorHAnsi"/>
-          <w:color w:val="404040" w:themeColor="text1" w:themeTint="BF"/>
-        </w:rPr>
-      </w:pPr>
-      <w:r>
-        <w:rPr>
-          <w:rFonts w:ascii="Inter 18pt" w:hAnsi="Inter 18pt" w:cstheme="minorHAnsi"/>
-          <w:color w:val="404040" w:themeColor="text1" w:themeTint="BF"/>
-        </w:rPr>
-        <w:t xml:space="preserve">Created </w:t>
-      </w:r>
-      <w:r>
-        <w:rPr>
-          <w:rFonts w:ascii="Inter 18pt" w:hAnsi="Inter 18pt" w:cstheme="minorHAnsi"/>
-          <w:b/>
-          <w:bCs/>
-          <w:color w:val="404040" w:themeColor="text1" w:themeTint="BF"/>
-        </w:rPr>
-        <w:t>visual identities and content formats</w:t>
-      </w:r>
-      <w:r>
-        <w:rPr>
-          <w:rFonts w:ascii="Inter 18pt" w:hAnsi="Inter 18pt" w:cstheme="minorHAnsi"/>
-          <w:color w:val="404040" w:themeColor="text1" w:themeTint="BF"/>
-        </w:rPr>
-        <w:t xml:space="preserve"> unique to the brand.</w:t>
+        <w:rPr>
+          <w:rFonts w:ascii="Inter 18pt" w:hAnsi="Inter 18pt" w:cstheme="minorHAnsi"/>
+          <w:color w:val="404040" w:themeColor="text1" w:themeTint="BF"/>
+        </w:rPr>
+      </w:pPr>
+      <w:r>
+        <w:rPr>
+          <w:rFonts w:ascii="Inter 18pt" w:hAnsi="Inter 18pt" w:cstheme="minorHAnsi"/>
+          <w:color w:val="404040" w:themeColor="text1" w:themeTint="BF"/>
+        </w:rPr>
+        <w:t xml:space="preserve">Develop location-based and lifestyle-driven Reels that highlight community value and property aesthetics, building audience trust at the top of the funnel. </w:t>
       </w:r>
     </w:p>
     <w:p>
@@ -1341,73 +1081,20 @@
         <w:pStyle w:val="ListParagraph"/>
         <w:numPr>
           <w:ilvl w:val="0"/>
-          <w:numId w:val="11"/>
+          <w:numId w:val="22"/>
         </w:numPr>
-        <w:spacing w:line="276" w:lineRule="auto"/>
-        <w:ind w:right="118"/>
-        <w:rPr>
-          <w:rStyle w:val="SubtleEmphasis"/>
-          <w:rFonts w:ascii="Inter 18pt" w:hAnsi="Inter 18pt" w:cstheme="minorHAnsi"/>
-          <w:i w:val="0"/>
-          <w:iCs w:val="0"/>
-        </w:rPr>
-      </w:pPr>
-      <w:r>
-        <w:rPr>
-          <w:rFonts w:ascii="Inter 18pt" w:hAnsi="Inter 18pt" w:cstheme="minorHAnsi"/>
-          <w:color w:val="404040" w:themeColor="text1" w:themeTint="BF"/>
-        </w:rPr>
-        <w:t>Less reliance on sponsored advertisements thanks to effective organic reach tactics.</w:t>
-      </w:r>
-    </w:p>
-    <w:p>
-      <w:pPr>
-        <w:spacing w:line="276" w:lineRule="auto"/>
-        <w:ind w:right="118"/>
-        <w:rPr>
-          <w:rStyle w:val="SubtleEmphasis"/>
-          <w:rFonts w:ascii="Inter 18pt" w:hAnsi="Inter 18pt" w:cstheme="minorHAnsi"/>
-          <w:b/>
-          <w:bCs/>
-          <w:i w:val="0"/>
-          <w:iCs w:val="0"/>
-        </w:rPr>
-      </w:pPr>
-    </w:p>
-    <w:p>
-      <w:pPr>
-        <w:spacing w:line="276" w:lineRule="auto"/>
-        <w:ind w:right="118"/>
-        <w:rPr>
-          <w:rStyle w:val="SubtleEmphasis"/>
-          <w:rFonts w:ascii="Inter 18pt" w:hAnsi="Inter 18pt" w:cstheme="minorHAnsi"/>
-          <w:b/>
-          <w:bCs/>
-          <w:i w:val="0"/>
-          <w:iCs w:val="0"/>
-        </w:rPr>
-      </w:pPr>
-      <w:r>
-        <w:rPr>
-          <w:rStyle w:val="SubtleEmphasis"/>
-          <w:rFonts w:ascii="Inter 18pt" w:hAnsi="Inter 18pt" w:cstheme="minorHAnsi"/>
-          <w:b/>
-          <w:bCs/>
-          <w:i w:val="0"/>
-          <w:iCs w:val="0"/>
-        </w:rPr>
-        <w:t>Responsibilities</w:t>
-      </w:r>
-      <w:r>
-        <w:rPr>
-          <w:rStyle w:val="SubtleEmphasis"/>
-          <w:rFonts w:ascii="Inter 18pt" w:hAnsi="Inter 18pt" w:cstheme="minorHAnsi"/>
-          <w:b/>
-          <w:bCs/>
-          <w:i w:val="0"/>
-          <w:iCs w:val="0"/>
-        </w:rPr>
-        <w:t>:</w:t>
+        <w:rPr>
+          <w:rFonts w:ascii="Inter 18pt" w:hAnsi="Inter 18pt" w:cstheme="minorHAnsi"/>
+          <w:color w:val="404040" w:themeColor="text1" w:themeTint="BF"/>
+        </w:rPr>
+      </w:pPr>
+      <w:r>
+        <w:rPr>
+          <w:rFonts w:ascii="Inter 18pt" w:hAnsi="Inter 18pt" w:cstheme="minorHAnsi"/>
+          <w:color w:val="404040" w:themeColor="text1" w:themeTint="BF"/>
+        </w:rPr>
+        <w:lastRenderedPageBreak/>
+        <w:t xml:space="preserve">Apply Adobe Premiere Pro, After Effects, and Photoshop to maintain a consistent visual identity across all platforms and property verticals. </w:t>
       </w:r>
     </w:p>
     <w:p>
@@ -1415,21 +1102,83 @@
         <w:pStyle w:val="ListParagraph"/>
         <w:numPr>
           <w:ilvl w:val="0"/>
-          <w:numId w:val="12"/>
+          <w:numId w:val="22"/>
         </w:numPr>
+      </w:pPr>
+      <w:r>
+        <w:rPr>
+          <w:rFonts w:ascii="Inter 18pt" w:hAnsi="Inter 18pt" w:cstheme="minorHAnsi"/>
+          <w:color w:val="404040" w:themeColor="text1" w:themeTint="BF"/>
+        </w:rPr>
+        <w:t>Leverage trend-timing and platform-native audio to keep the brand competitive in an increasingly content-saturated real estate market.</w:t>
+      </w:r>
+    </w:p>
+    <w:p>
+      <w:pPr>
         <w:spacing w:line="276" w:lineRule="auto"/>
-        <w:ind w:right="118"/>
-        <w:rPr>
-          <w:rFonts w:ascii="Inter 18pt" w:hAnsi="Inter 18pt" w:cstheme="minorHAnsi"/>
-          <w:color w:val="404040" w:themeColor="text1" w:themeTint="BF"/>
-        </w:rPr>
-      </w:pPr>
-      <w:r>
-        <w:rPr>
-          <w:rFonts w:ascii="Inter 18pt" w:hAnsi="Inter 18pt" w:cstheme="minorHAnsi"/>
-          <w:color w:val="404040" w:themeColor="text1" w:themeTint="BF"/>
-        </w:rPr>
-        <w:t>Scripting, creative direction, and content ideation</w:t>
+        <w:rPr>
+          <w:rStyle w:val="SubtleEmphasis"/>
+          <w:rFonts w:ascii="Inter 18pt" w:hAnsi="Inter 18pt" w:cstheme="minorHAnsi"/>
+          <w:b/>
+          <w:bCs/>
+          <w:i w:val="0"/>
+          <w:iCs w:val="0"/>
+        </w:rPr>
+      </w:pPr>
+      <w:r>
+        <w:rPr>
+          <w:rStyle w:val="SubtleEmphasis"/>
+          <w:rFonts w:ascii="Inter 18pt" w:hAnsi="Inter 18pt" w:cstheme="minorHAnsi"/>
+          <w:b/>
+          <w:bCs/>
+          <w:i w:val="0"/>
+          <w:iCs w:val="0"/>
+        </w:rPr>
+        <w:t>Social Media Growth Manager &amp; Creative Strategist</w:t>
+      </w:r>
+      <w:r>
+        <w:rPr>
+          <w:rStyle w:val="SubtleEmphasis"/>
+          <w:rFonts w:ascii="Inter 18pt" w:hAnsi="Inter 18pt" w:cstheme="minorHAnsi"/>
+          <w:b/>
+          <w:bCs/>
+          <w:i w:val="0"/>
+          <w:iCs w:val="0"/>
+        </w:rPr>
+        <w:t xml:space="preserve"> - UAE &amp; INDIA</w:t>
+      </w:r>
+      <w:r>
+        <w:rPr>
+          <w:rStyle w:val="SubtleEmphasis"/>
+          <w:rFonts w:ascii="Inter 18pt" w:hAnsi="Inter 18pt" w:cstheme="minorHAnsi"/>
+          <w:b/>
+          <w:bCs/>
+          <w:i w:val="0"/>
+          <w:iCs w:val="0"/>
+        </w:rPr>
+        <w:t xml:space="preserve"> (</w:t>
+      </w:r>
+      <w:r>
+        <w:rPr>
+          <w:rStyle w:val="SubtleEmphasis"/>
+          <w:rFonts w:ascii="Inter 18pt" w:hAnsi="Inter 18pt" w:cstheme="minorHAnsi"/>
+          <w:b/>
+          <w:bCs/>
+          <w:i w:val="0"/>
+          <w:iCs w:val="0"/>
+        </w:rPr>
+        <w:t>Freelance)</w:t>
+      </w:r>
+      <w:r>
+        <w:rPr>
+          <w:rStyle w:val="SubtleEmphasis"/>
+          <w:rFonts w:ascii="Inter 18pt" w:hAnsi="Inter 18pt" w:cstheme="minorHAnsi"/>
+          <w:b/>
+          <w:bCs/>
+          <w:i w:val="0"/>
+          <w:iCs w:val="0"/>
+        </w:rPr>
+        <w:t xml:space="preserve">         2022 - Present</w:t>
       </w:r>
     </w:p>
     <w:p>
@@ -1437,21 +1186,45 @@
         <w:pStyle w:val="ListParagraph"/>
         <w:numPr>
           <w:ilvl w:val="0"/>
-          <w:numId w:val="12"/>
+          <w:numId w:val="19"/>
         </w:numPr>
         <w:spacing w:line="276" w:lineRule="auto"/>
-        <w:ind w:right="118"/>
-        <w:rPr>
-          <w:rFonts w:ascii="Inter 18pt" w:hAnsi="Inter 18pt" w:cstheme="minorHAnsi"/>
-          <w:color w:val="404040" w:themeColor="text1" w:themeTint="BF"/>
-        </w:rPr>
-      </w:pPr>
-      <w:r>
-        <w:rPr>
-          <w:rFonts w:ascii="Inter 18pt" w:hAnsi="Inter 18pt" w:cstheme="minorHAnsi"/>
-          <w:color w:val="404040" w:themeColor="text1" w:themeTint="BF"/>
-        </w:rPr>
-        <w:t>Production of reels and short-form narrative</w:t>
+        <w:ind w:right="260"/>
+        <w:rPr>
+          <w:rStyle w:val="SubtleEmphasis"/>
+          <w:rFonts w:ascii="Inter 18pt" w:hAnsi="Inter 18pt" w:cstheme="minorHAnsi"/>
+          <w:i w:val="0"/>
+          <w:iCs w:val="0"/>
+        </w:rPr>
+      </w:pPr>
+      <w:r>
+        <w:rPr>
+          <w:rStyle w:val="SubtleEmphasis"/>
+          <w:rFonts w:ascii="Inter 18pt" w:hAnsi="Inter 18pt" w:cstheme="minorHAnsi"/>
+          <w:i w:val="0"/>
+          <w:iCs w:val="0"/>
+        </w:rPr>
+        <w:t xml:space="preserve">Grew Instagram/YouTube brand accounts from </w:t>
+      </w:r>
+      <w:r>
+        <w:rPr>
+          <w:rStyle w:val="SubtleEmphasis"/>
+          <w:rFonts w:ascii="Inter 18pt" w:hAnsi="Inter 18pt" w:cstheme="minorHAnsi"/>
+          <w:b/>
+          <w:bCs/>
+          <w:i w:val="0"/>
+          <w:iCs w:val="0"/>
+        </w:rPr>
+        <w:t>0 to 107K followers in 6 months</w:t>
+      </w:r>
+      <w:r>
+        <w:rPr>
+          <w:rStyle w:val="SubtleEmphasis"/>
+          <w:rFonts w:ascii="Inter 18pt" w:hAnsi="Inter 18pt" w:cstheme="minorHAnsi"/>
+          <w:i w:val="0"/>
+          <w:iCs w:val="0"/>
+        </w:rPr>
+        <w:t xml:space="preserve"> using viral Reels, trend-based scripting, and retention-focused editing.</w:t>
       </w:r>
     </w:p>
     <w:p>
@@ -1459,21 +1232,45 @@
         <w:pStyle w:val="ListParagraph"/>
         <w:numPr>
           <w:ilvl w:val="0"/>
-          <w:numId w:val="12"/>
+          <w:numId w:val="19"/>
         </w:numPr>
         <w:spacing w:line="276" w:lineRule="auto"/>
-        <w:ind w:right="118"/>
-        <w:rPr>
-          <w:rFonts w:ascii="Inter 18pt" w:hAnsi="Inter 18pt" w:cstheme="minorHAnsi"/>
-          <w:color w:val="404040" w:themeColor="text1" w:themeTint="BF"/>
-        </w:rPr>
-      </w:pPr>
-      <w:r>
-        <w:rPr>
-          <w:rFonts w:ascii="Inter 18pt" w:hAnsi="Inter 18pt" w:cstheme="minorHAnsi"/>
-          <w:color w:val="404040" w:themeColor="text1" w:themeTint="BF"/>
-        </w:rPr>
-        <w:t>Social media visual branding</w:t>
+        <w:ind w:right="260"/>
+        <w:rPr>
+          <w:rStyle w:val="SubtleEmphasis"/>
+          <w:rFonts w:ascii="Inter 18pt" w:hAnsi="Inter 18pt" w:cstheme="minorHAnsi"/>
+          <w:i w:val="0"/>
+          <w:iCs w:val="0"/>
+        </w:rPr>
+      </w:pPr>
+      <w:r>
+        <w:rPr>
+          <w:rStyle w:val="SubtleEmphasis"/>
+          <w:rFonts w:ascii="Inter 18pt" w:hAnsi="Inter 18pt" w:cstheme="minorHAnsi"/>
+          <w:i w:val="0"/>
+          <w:iCs w:val="0"/>
+        </w:rPr>
+        <w:t xml:space="preserve">Boosted organic engagement by </w:t>
+      </w:r>
+      <w:r>
+        <w:rPr>
+          <w:rStyle w:val="SubtleEmphasis"/>
+          <w:rFonts w:ascii="Inter 18pt" w:hAnsi="Inter 18pt" w:cstheme="minorHAnsi"/>
+          <w:b/>
+          <w:bCs/>
+          <w:i w:val="0"/>
+          <w:iCs w:val="0"/>
+        </w:rPr>
+        <w:t>300-800%</w:t>
+      </w:r>
+      <w:r>
+        <w:rPr>
+          <w:rStyle w:val="SubtleEmphasis"/>
+          <w:rFonts w:ascii="Inter 18pt" w:hAnsi="Inter 18pt" w:cstheme="minorHAnsi"/>
+          <w:i w:val="0"/>
+          <w:iCs w:val="0"/>
+        </w:rPr>
+        <w:t xml:space="preserve"> through 1-2s hook optimization and trending audio formats.</w:t>
       </w:r>
     </w:p>
     <w:p>
@@ -1481,21 +1278,45 @@
         <w:pStyle w:val="ListParagraph"/>
         <w:numPr>
           <w:ilvl w:val="0"/>
-          <w:numId w:val="12"/>
+          <w:numId w:val="19"/>
         </w:numPr>
         <w:spacing w:line="276" w:lineRule="auto"/>
-        <w:ind w:right="118"/>
-        <w:rPr>
-          <w:rFonts w:ascii="Inter 18pt" w:hAnsi="Inter 18pt" w:cstheme="minorHAnsi"/>
-          <w:color w:val="404040" w:themeColor="text1" w:themeTint="BF"/>
-        </w:rPr>
-      </w:pPr>
-      <w:r>
-        <w:rPr>
-          <w:rFonts w:ascii="Inter 18pt" w:hAnsi="Inter 18pt" w:cstheme="minorHAnsi"/>
-          <w:color w:val="404040" w:themeColor="text1" w:themeTint="BF"/>
-        </w:rPr>
-        <w:t>Growth reporting and performance analysis</w:t>
+        <w:ind w:right="260"/>
+        <w:rPr>
+          <w:rStyle w:val="SubtleEmphasis"/>
+          <w:rFonts w:ascii="Inter 18pt" w:hAnsi="Inter 18pt" w:cstheme="minorHAnsi"/>
+          <w:i w:val="0"/>
+          <w:iCs w:val="0"/>
+        </w:rPr>
+      </w:pPr>
+      <w:r>
+        <w:rPr>
+          <w:rStyle w:val="SubtleEmphasis"/>
+          <w:rFonts w:ascii="Inter 18pt" w:hAnsi="Inter 18pt" w:cstheme="minorHAnsi"/>
+          <w:i w:val="0"/>
+          <w:iCs w:val="0"/>
+        </w:rPr>
+        <w:t xml:space="preserve">Produced </w:t>
+      </w:r>
+      <w:r>
+        <w:rPr>
+          <w:rStyle w:val="SubtleEmphasis"/>
+          <w:rFonts w:ascii="Inter 18pt" w:hAnsi="Inter 18pt" w:cstheme="minorHAnsi"/>
+          <w:b/>
+          <w:bCs/>
+          <w:i w:val="0"/>
+          <w:iCs w:val="0"/>
+        </w:rPr>
+        <w:t>100+ high-retention videos</w:t>
+      </w:r>
+      <w:r>
+        <w:rPr>
+          <w:rStyle w:val="SubtleEmphasis"/>
+          <w:rFonts w:ascii="Inter 18pt" w:hAnsi="Inter 18pt" w:cstheme="minorHAnsi"/>
+          <w:i w:val="0"/>
+          <w:iCs w:val="0"/>
+        </w:rPr>
+        <w:t xml:space="preserve"> using Premiere Pro/After Effects by auditing drop-off points.</w:t>
       </w:r>
     </w:p>
     <w:p>
@@ -1503,21 +1324,65 @@
         <w:pStyle w:val="ListParagraph"/>
         <w:numPr>
           <w:ilvl w:val="0"/>
-          <w:numId w:val="12"/>
+          <w:numId w:val="19"/>
         </w:numPr>
         <w:spacing w:line="276" w:lineRule="auto"/>
-        <w:ind w:right="118"/>
-        <w:rPr>
-          <w:rFonts w:ascii="Inter 18pt" w:hAnsi="Inter 18pt" w:cstheme="minorHAnsi"/>
-          <w:color w:val="404040" w:themeColor="text1" w:themeTint="BF"/>
-        </w:rPr>
-      </w:pPr>
-      <w:r>
-        <w:rPr>
-          <w:rFonts w:ascii="Inter 18pt" w:hAnsi="Inter 18pt" w:cstheme="minorHAnsi"/>
-          <w:color w:val="404040" w:themeColor="text1" w:themeTint="BF"/>
-        </w:rPr>
-        <w:t>Strategy for community engagement</w:t>
+        <w:ind w:right="260"/>
+        <w:rPr>
+          <w:rStyle w:val="SubtleEmphasis"/>
+          <w:rFonts w:ascii="Inter 18pt" w:hAnsi="Inter 18pt" w:cstheme="minorHAnsi"/>
+          <w:i w:val="0"/>
+          <w:iCs w:val="0"/>
+        </w:rPr>
+      </w:pPr>
+      <w:r>
+        <w:rPr>
+          <w:rStyle w:val="SubtleEmphasis"/>
+          <w:rFonts w:ascii="Inter 18pt" w:hAnsi="Inter 18pt" w:cstheme="minorHAnsi"/>
+          <w:i w:val="0"/>
+          <w:iCs w:val="0"/>
+        </w:rPr>
+        <w:t xml:space="preserve">Delivered </w:t>
+      </w:r>
+      <w:r>
+        <w:rPr>
+          <w:rStyle w:val="SubtleEmphasis"/>
+          <w:rFonts w:ascii="Inter 18pt" w:hAnsi="Inter 18pt" w:cstheme="minorHAnsi"/>
+          <w:b/>
+          <w:bCs/>
+          <w:i w:val="0"/>
+          <w:iCs w:val="0"/>
+        </w:rPr>
+        <w:t>22M+ organic views</w:t>
+      </w:r>
+      <w:r>
+        <w:rPr>
+          <w:rStyle w:val="SubtleEmphasis"/>
+          <w:rFonts w:ascii="Inter 18pt" w:hAnsi="Inter 18pt" w:cstheme="minorHAnsi"/>
+          <w:i w:val="0"/>
+          <w:iCs w:val="0"/>
+        </w:rPr>
+        <w:t xml:space="preserve"> for </w:t>
+      </w:r>
+      <w:r>
+        <w:rPr>
+          <w:rStyle w:val="SubtleEmphasis"/>
+          <w:rFonts w:ascii="Inter 18pt" w:hAnsi="Inter 18pt" w:cstheme="minorHAnsi"/>
+          <w:b/>
+          <w:bCs/>
+          <w:i w:val="0"/>
+          <w:iCs w:val="0"/>
+        </w:rPr>
+        <w:t>15+ clients</w:t>
+      </w:r>
+      <w:r>
+        <w:rPr>
+          <w:rStyle w:val="SubtleEmphasis"/>
+          <w:rFonts w:ascii="Inter 18pt" w:hAnsi="Inter 18pt" w:cstheme="minorHAnsi"/>
+          <w:i w:val="0"/>
+          <w:iCs w:val="0"/>
+        </w:rPr>
+        <w:t xml:space="preserve"> via data-driven campaign management and brand KPI alignment.</w:t>
       </w:r>
     </w:p>
     <w:p>
@@ -1525,21 +1390,45 @@
         <w:pStyle w:val="ListParagraph"/>
         <w:numPr>
           <w:ilvl w:val="0"/>
-          <w:numId w:val="12"/>
+          <w:numId w:val="19"/>
         </w:numPr>
         <w:spacing w:line="276" w:lineRule="auto"/>
-        <w:ind w:right="118"/>
-        <w:rPr>
-          <w:rFonts w:ascii="Inter 18pt" w:hAnsi="Inter 18pt" w:cstheme="minorHAnsi"/>
-          <w:color w:val="404040" w:themeColor="text1" w:themeTint="BF"/>
-        </w:rPr>
-      </w:pPr>
-      <w:r>
-        <w:rPr>
-          <w:rFonts w:ascii="Inter 18pt" w:hAnsi="Inter 18pt" w:cstheme="minorHAnsi"/>
-          <w:color w:val="404040" w:themeColor="text1" w:themeTint="BF"/>
-        </w:rPr>
-        <w:t>Planning for influencer collaboration</w:t>
+        <w:ind w:right="260"/>
+        <w:rPr>
+          <w:rStyle w:val="SubtleEmphasis"/>
+          <w:rFonts w:ascii="Inter 18pt" w:hAnsi="Inter 18pt" w:cstheme="minorHAnsi"/>
+          <w:i w:val="0"/>
+          <w:iCs w:val="0"/>
+        </w:rPr>
+      </w:pPr>
+      <w:r>
+        <w:rPr>
+          <w:rStyle w:val="SubtleEmphasis"/>
+          <w:rFonts w:ascii="Inter 18pt" w:hAnsi="Inter 18pt" w:cstheme="minorHAnsi"/>
+          <w:i w:val="0"/>
+          <w:iCs w:val="0"/>
+        </w:rPr>
+        <w:t xml:space="preserve">Created </w:t>
+      </w:r>
+      <w:r>
+        <w:rPr>
+          <w:rStyle w:val="SubtleEmphasis"/>
+          <w:rFonts w:ascii="Inter 18pt" w:hAnsi="Inter 18pt" w:cstheme="minorHAnsi"/>
+          <w:b/>
+          <w:bCs/>
+          <w:i w:val="0"/>
+          <w:iCs w:val="0"/>
+        </w:rPr>
+        <w:t>50+ viral Reels</w:t>
+      </w:r>
+      <w:r>
+        <w:rPr>
+          <w:rStyle w:val="SubtleEmphasis"/>
+          <w:rFonts w:ascii="Inter 18pt" w:hAnsi="Inter 18pt" w:cstheme="minorHAnsi"/>
+          <w:i w:val="0"/>
+          <w:iCs w:val="0"/>
+        </w:rPr>
+        <w:t xml:space="preserve"> (1M+ views each) by reverse-engineering algorithms and optimizing watch-time.</w:t>
       </w:r>
     </w:p>
     <w:p>
@@ -1547,247 +1436,45 @@
         <w:pStyle w:val="ListParagraph"/>
         <w:numPr>
           <w:ilvl w:val="0"/>
-          <w:numId w:val="12"/>
+          <w:numId w:val="19"/>
         </w:numPr>
         <w:spacing w:line="276" w:lineRule="auto"/>
-        <w:ind w:right="118"/>
-        <w:rPr>
-          <w:rStyle w:val="SubtleEmphasis"/>
-          <w:rFonts w:ascii="Inter 18pt" w:hAnsi="Inter 18pt" w:cstheme="minorHAnsi"/>
-          <w:b/>
-          <w:bCs/>
-          <w:i w:val="0"/>
-          <w:iCs w:val="0"/>
-        </w:rPr>
-      </w:pPr>
-      <w:r>
-        <w:rPr>
-          <w:rFonts w:ascii="Inter 18pt" w:hAnsi="Inter 18pt" w:cstheme="minorHAnsi"/>
-          <w:color w:val="404040" w:themeColor="text1" w:themeTint="BF"/>
-        </w:rPr>
-        <w:t>Audits and monthly content calendars</w:t>
-      </w:r>
-    </w:p>
-    <w:p>
-      <w:pPr>
-        <w:spacing w:line="276" w:lineRule="auto"/>
-        <w:rPr>
-          <w:rStyle w:val="SubtleEmphasis"/>
-          <w:rFonts w:ascii="Inter 18pt" w:hAnsi="Inter 18pt" w:cstheme="minorHAnsi"/>
-          <w:b/>
-          <w:bCs/>
-          <w:i w:val="0"/>
-          <w:iCs w:val="0"/>
-        </w:rPr>
-      </w:pPr>
-      <w:r>
-        <w:rPr>
-          <w:rStyle w:val="SubtleEmphasis"/>
-          <w:rFonts w:ascii="Inter 18pt" w:hAnsi="Inter 18pt" w:cstheme="minorHAnsi"/>
-          <w:b/>
-          <w:bCs/>
-          <w:i w:val="0"/>
-          <w:iCs w:val="0"/>
-        </w:rPr>
-        <w:t xml:space="preserve">Creative Content Designer – Music Temple Pvt </w:t>
-      </w:r>
-      <w:r>
-        <w:rPr>
-          <w:rStyle w:val="SubtleEmphasis"/>
-          <w:rFonts w:ascii="Inter 18pt" w:hAnsi="Inter 18pt" w:cstheme="minorHAnsi"/>
-          <w:b/>
-          <w:bCs/>
-          <w:i w:val="0"/>
-          <w:iCs w:val="0"/>
-        </w:rPr>
-        <w:t>Ltd</w:t>
-      </w:r>
-      <w:r>
-        <w:rPr>
-          <w:rStyle w:val="SubtleEmphasis"/>
-          <w:rFonts w:ascii="Inter 18pt" w:hAnsi="Inter 18pt" w:cstheme="minorHAnsi"/>
-          <w:b/>
-          <w:bCs/>
-          <w:i w:val="0"/>
-          <w:iCs w:val="0"/>
-        </w:rPr>
-        <w:t>, IITM</w:t>
-      </w:r>
-      <w:r>
-        <w:rPr>
-          <w:rStyle w:val="SubtleEmphasis"/>
-          <w:rFonts w:ascii="Inter 18pt" w:hAnsi="Inter 18pt" w:cstheme="minorHAnsi"/>
-          <w:b/>
-          <w:bCs/>
-          <w:i w:val="0"/>
-          <w:iCs w:val="0"/>
-        </w:rPr>
-        <w:t>R</w:t>
-      </w:r>
-      <w:r>
-        <w:rPr>
-          <w:rStyle w:val="SubtleEmphasis"/>
-          <w:rFonts w:ascii="Inter 18pt" w:hAnsi="Inter 18pt" w:cstheme="minorHAnsi"/>
-          <w:b/>
-          <w:bCs/>
-          <w:i w:val="0"/>
-          <w:iCs w:val="0"/>
-        </w:rPr>
-        <w:t>P</w:t>
-      </w:r>
-      <w:r>
-        <w:rPr>
-          <w:rStyle w:val="SubtleEmphasis"/>
-          <w:rFonts w:ascii="Inter 18pt" w:hAnsi="Inter 18pt" w:cstheme="minorHAnsi"/>
-          <w:b/>
-          <w:bCs/>
-          <w:i w:val="0"/>
-          <w:iCs w:val="0"/>
-        </w:rPr>
-        <w:t xml:space="preserve">     </w:t>
-      </w:r>
-      <w:r>
-        <w:rPr>
-          <w:rStyle w:val="SubtleEmphasis"/>
-          <w:rFonts w:ascii="Inter 18pt" w:hAnsi="Inter 18pt" w:cstheme="minorHAnsi"/>
-          <w:b/>
-          <w:bCs/>
-          <w:i w:val="0"/>
-          <w:iCs w:val="0"/>
-        </w:rPr>
-        <w:t xml:space="preserve">   </w:t>
-      </w:r>
-      <w:r>
-        <w:rPr>
-          <w:rStyle w:val="SubtleEmphasis"/>
-          <w:rFonts w:ascii="Inter 18pt" w:hAnsi="Inter 18pt" w:cstheme="minorHAnsi"/>
-          <w:b/>
-          <w:bCs/>
-          <w:i w:val="0"/>
-          <w:iCs w:val="0"/>
-        </w:rPr>
-        <w:t xml:space="preserve"> </w:t>
-      </w:r>
-      <w:r>
-        <w:rPr>
-          <w:rStyle w:val="SubtleEmphasis"/>
-          <w:rFonts w:ascii="Inter 18pt" w:hAnsi="Inter 18pt" w:cstheme="minorHAnsi"/>
-          <w:b/>
-          <w:bCs/>
-          <w:i w:val="0"/>
-          <w:iCs w:val="0"/>
-        </w:rPr>
-        <w:t>Oct</w:t>
-      </w:r>
-      <w:r>
-        <w:rPr>
-          <w:rStyle w:val="SubtleEmphasis"/>
-          <w:rFonts w:ascii="Inter 18pt" w:hAnsi="Inter 18pt" w:cstheme="minorHAnsi"/>
-          <w:b/>
-          <w:bCs/>
-          <w:i w:val="0"/>
-          <w:iCs w:val="0"/>
-        </w:rPr>
-        <w:t>ober</w:t>
-      </w:r>
-      <w:r>
-        <w:rPr>
-          <w:rStyle w:val="SubtleEmphasis"/>
-          <w:rFonts w:ascii="Inter 18pt" w:hAnsi="Inter 18pt" w:cstheme="minorHAnsi"/>
-          <w:b/>
-          <w:bCs/>
-          <w:i w:val="0"/>
-          <w:iCs w:val="0"/>
-        </w:rPr>
-        <w:t xml:space="preserve"> </w:t>
-      </w:r>
-      <w:r>
-        <w:rPr>
-          <w:rStyle w:val="SubtleEmphasis"/>
-          <w:rFonts w:ascii="Inter 18pt" w:hAnsi="Inter 18pt" w:cstheme="minorHAnsi"/>
-          <w:b/>
-          <w:bCs/>
-          <w:i w:val="0"/>
-          <w:iCs w:val="0"/>
-        </w:rPr>
-        <w:t>202</w:t>
-      </w:r>
-      <w:r>
-        <w:rPr>
-          <w:rStyle w:val="SubtleEmphasis"/>
-          <w:rFonts w:ascii="Inter 18pt" w:hAnsi="Inter 18pt" w:cstheme="minorHAnsi"/>
-          <w:b/>
-          <w:bCs/>
-          <w:i w:val="0"/>
-          <w:iCs w:val="0"/>
-        </w:rPr>
-        <w:t>4</w:t>
-      </w:r>
-      <w:r>
-        <w:rPr>
-          <w:rStyle w:val="SubtleEmphasis"/>
-          <w:rFonts w:ascii="Inter 18pt" w:hAnsi="Inter 18pt" w:cstheme="minorHAnsi"/>
-          <w:b/>
-          <w:bCs/>
-          <w:i w:val="0"/>
-          <w:iCs w:val="0"/>
-        </w:rPr>
-        <w:t xml:space="preserve"> </w:t>
-      </w:r>
-      <w:r>
-        <w:rPr>
-          <w:rStyle w:val="SubtleEmphasis"/>
-          <w:rFonts w:ascii="Inter 18pt" w:hAnsi="Inter 18pt" w:cstheme="minorHAnsi"/>
-          <w:b/>
-          <w:bCs/>
-          <w:i w:val="0"/>
-          <w:iCs w:val="0"/>
-        </w:rPr>
-        <w:t>–</w:t>
-      </w:r>
-      <w:r>
-        <w:rPr>
-          <w:rStyle w:val="SubtleEmphasis"/>
-          <w:rFonts w:ascii="Inter 18pt" w:hAnsi="Inter 18pt" w:cstheme="minorHAnsi"/>
-          <w:b/>
-          <w:bCs/>
-          <w:i w:val="0"/>
-          <w:iCs w:val="0"/>
-        </w:rPr>
-        <w:t xml:space="preserve"> </w:t>
-      </w:r>
-      <w:r>
-        <w:rPr>
-          <w:rStyle w:val="SubtleEmphasis"/>
-          <w:rFonts w:ascii="Inter 18pt" w:hAnsi="Inter 18pt" w:cstheme="minorHAnsi"/>
-          <w:b/>
-          <w:bCs/>
-          <w:i w:val="0"/>
-          <w:iCs w:val="0"/>
-        </w:rPr>
-        <w:t>Nov</w:t>
-      </w:r>
-      <w:r>
-        <w:rPr>
-          <w:rStyle w:val="SubtleEmphasis"/>
-          <w:rFonts w:ascii="Inter 18pt" w:hAnsi="Inter 18pt" w:cstheme="minorHAnsi"/>
-          <w:b/>
-          <w:bCs/>
-          <w:i w:val="0"/>
-          <w:iCs w:val="0"/>
-        </w:rPr>
-        <w:t>ember</w:t>
-      </w:r>
-      <w:r>
-        <w:rPr>
-          <w:rStyle w:val="SubtleEmphasis"/>
-          <w:rFonts w:ascii="Inter 18pt" w:hAnsi="Inter 18pt" w:cstheme="minorHAnsi"/>
-          <w:b/>
-          <w:bCs/>
-          <w:i w:val="0"/>
-          <w:iCs w:val="0"/>
-        </w:rPr>
-        <w:t xml:space="preserve"> 2025</w:t>
+        <w:ind w:right="260"/>
+        <w:rPr>
+          <w:rStyle w:val="SubtleEmphasis"/>
+          <w:rFonts w:ascii="Inter 18pt" w:hAnsi="Inter 18pt" w:cstheme="minorHAnsi"/>
+          <w:i w:val="0"/>
+          <w:iCs w:val="0"/>
+        </w:rPr>
+      </w:pPr>
+      <w:r>
+        <w:rPr>
+          <w:rStyle w:val="SubtleEmphasis"/>
+          <w:rFonts w:ascii="Inter 18pt" w:hAnsi="Inter 18pt" w:cstheme="minorHAnsi"/>
+          <w:i w:val="0"/>
+          <w:iCs w:val="0"/>
+        </w:rPr>
+        <w:t xml:space="preserve">Reduced paid ad dependency by </w:t>
+      </w:r>
+      <w:r>
+        <w:rPr>
+          <w:rStyle w:val="SubtleEmphasis"/>
+          <w:rFonts w:ascii="Inter 18pt" w:hAnsi="Inter 18pt" w:cstheme="minorHAnsi"/>
+          <w:b/>
+          <w:bCs/>
+          <w:i w:val="0"/>
+          <w:iCs w:val="0"/>
+        </w:rPr>
+        <w:t>70% through trend-timing strategies</w:t>
+      </w:r>
+      <w:r>
+        <w:rPr>
+          <w:rStyle w:val="SubtleEmphasis"/>
+          <w:rFonts w:ascii="Inter 18pt" w:hAnsi="Inter 18pt" w:cstheme="minorHAnsi"/>
+          <w:i w:val="0"/>
+          <w:iCs w:val="0"/>
+        </w:rPr>
+        <w:t xml:space="preserve"> and format diversification.</w:t>
       </w:r>
     </w:p>
     <w:p>
@@ -1795,32 +1482,36 @@
         <w:pStyle w:val="ListParagraph"/>
         <w:numPr>
           <w:ilvl w:val="0"/>
-          <w:numId w:val="13"/>
+          <w:numId w:val="19"/>
         </w:numPr>
         <w:spacing w:line="276" w:lineRule="auto"/>
-        <w:ind w:right="118"/>
-        <w:rPr>
-          <w:rFonts w:ascii="Inter 18pt" w:hAnsi="Inter 18pt" w:cstheme="minorHAnsi"/>
-          <w:b/>
-          <w:bCs/>
-          <w:color w:val="404040" w:themeColor="text1" w:themeTint="BF"/>
-        </w:rPr>
-      </w:pPr>
-      <w:r>
-        <w:rPr>
-          <w:rFonts w:ascii="Inter 18pt" w:hAnsi="Inter 18pt" w:cstheme="minorHAnsi"/>
-          <w:color w:val="404040" w:themeColor="text1" w:themeTint="BF"/>
-        </w:rPr>
-        <w:t xml:space="preserve">Developed and produced successful short-form content for </w:t>
-      </w:r>
-      <w:r>
-        <w:rPr>
-          <w:rFonts w:ascii="Inter 18pt" w:hAnsi="Inter 18pt" w:cstheme="minorHAnsi"/>
-          <w:b/>
-          <w:bCs/>
-          <w:color w:val="404040" w:themeColor="text1" w:themeTint="BF"/>
-        </w:rPr>
-        <w:t>entertainment and music companies.</w:t>
+        <w:ind w:right="260"/>
+        <w:rPr>
+          <w:rStyle w:val="SubtleEmphasis"/>
+          <w:rFonts w:ascii="Inter 18pt" w:hAnsi="Inter 18pt" w:cstheme="minorHAnsi"/>
+          <w:i w:val="0"/>
+          <w:iCs w:val="0"/>
+        </w:rPr>
+      </w:pPr>
+      <w:r>
+        <w:rPr>
+          <w:rStyle w:val="SubtleEmphasis"/>
+          <w:rFonts w:ascii="Inter 18pt" w:hAnsi="Inter 18pt" w:cstheme="minorHAnsi"/>
+          <w:b/>
+          <w:bCs/>
+          <w:i w:val="0"/>
+          <w:iCs w:val="0"/>
+        </w:rPr>
+        <w:t>Scaled production pipelines by 30%</w:t>
+      </w:r>
+      <w:r>
+        <w:rPr>
+          <w:rStyle w:val="SubtleEmphasis"/>
+          <w:rFonts w:ascii="Inter 18pt" w:hAnsi="Inter 18pt" w:cstheme="minorHAnsi"/>
+          <w:i w:val="0"/>
+          <w:iCs w:val="0"/>
+        </w:rPr>
+        <w:t xml:space="preserve"> using Adobe Creative Cloud while maintaining quality.</w:t>
       </w:r>
     </w:p>
     <w:p>
@@ -1828,48 +1519,25 @@
         <w:pStyle w:val="ListParagraph"/>
         <w:numPr>
           <w:ilvl w:val="0"/>
-          <w:numId w:val="13"/>
+          <w:numId w:val="19"/>
         </w:numPr>
         <w:spacing w:line="276" w:lineRule="auto"/>
-        <w:ind w:right="118"/>
-        <w:rPr>
-          <w:rFonts w:ascii="Inter 18pt" w:hAnsi="Inter 18pt" w:cstheme="minorHAnsi"/>
-          <w:b/>
-          <w:bCs/>
-          <w:color w:val="404040" w:themeColor="text1" w:themeTint="BF"/>
-        </w:rPr>
-      </w:pPr>
-      <w:r>
-        <w:rPr>
-          <w:rFonts w:ascii="Inter 18pt" w:hAnsi="Inter 18pt" w:cstheme="minorHAnsi"/>
-          <w:color w:val="404040" w:themeColor="text1" w:themeTint="BF"/>
-        </w:rPr>
-        <w:t xml:space="preserve">Managed the </w:t>
-      </w:r>
-      <w:r>
-        <w:rPr>
-          <w:rFonts w:ascii="Inter 18pt" w:hAnsi="Inter 18pt" w:cstheme="minorHAnsi"/>
-          <w:b/>
-          <w:bCs/>
-          <w:color w:val="404040" w:themeColor="text1" w:themeTint="BF"/>
-        </w:rPr>
-        <w:t>entire content pipeline</w:t>
-      </w:r>
-      <w:r>
-        <w:rPr>
-          <w:rFonts w:ascii="Inter 18pt" w:hAnsi="Inter 18pt" w:cstheme="minorHAnsi"/>
-          <w:color w:val="404040" w:themeColor="text1" w:themeTint="BF"/>
-        </w:rPr>
-        <w:t xml:space="preserve">, which included </w:t>
-      </w:r>
-      <w:r>
-        <w:rPr>
-          <w:rFonts w:ascii="Inter 18pt" w:hAnsi="Inter 18pt" w:cstheme="minorHAnsi"/>
-          <w:b/>
-          <w:bCs/>
-          <w:color w:val="404040" w:themeColor="text1" w:themeTint="BF"/>
-        </w:rPr>
-        <w:t>motion graphics, editing, shooting, scripting, and concept development.</w:t>
+        <w:ind w:right="260"/>
+        <w:rPr>
+          <w:rStyle w:val="SubtleEmphasis"/>
+          <w:rFonts w:ascii="Inter 18pt" w:hAnsi="Inter 18pt" w:cstheme="minorHAnsi"/>
+          <w:i w:val="0"/>
+          <w:iCs w:val="0"/>
+        </w:rPr>
+      </w:pPr>
+      <w:r>
+        <w:rPr>
+          <w:rStyle w:val="SubtleEmphasis"/>
+          <w:rFonts w:ascii="Inter 18pt" w:hAnsi="Inter 18pt" w:cstheme="minorHAnsi"/>
+          <w:i w:val="0"/>
+          <w:iCs w:val="0"/>
+        </w:rPr>
+        <w:t>Designed 8+ brand identity systems and content templates for cross-platform consistency.</w:t>
       </w:r>
     </w:p>
     <w:p>
@@ -1877,21 +1545,36 @@
         <w:pStyle w:val="ListParagraph"/>
         <w:numPr>
           <w:ilvl w:val="0"/>
-          <w:numId w:val="13"/>
+          <w:numId w:val="19"/>
         </w:numPr>
         <w:spacing w:line="276" w:lineRule="auto"/>
-        <w:ind w:right="118"/>
-        <w:rPr>
-          <w:rFonts w:ascii="Inter 18pt" w:hAnsi="Inter 18pt" w:cstheme="minorHAnsi"/>
-          <w:color w:val="404040" w:themeColor="text1" w:themeTint="BF"/>
-        </w:rPr>
-      </w:pPr>
-      <w:r>
-        <w:rPr>
-          <w:rFonts w:ascii="Inter 18pt" w:hAnsi="Inter 18pt" w:cstheme="minorHAnsi"/>
-          <w:color w:val="404040" w:themeColor="text1" w:themeTint="BF"/>
-        </w:rPr>
-        <w:t>Worked together with internal teams and artists to create visually coherent brand content.</w:t>
+        <w:ind w:right="260"/>
+        <w:rPr>
+          <w:rStyle w:val="SubtleEmphasis"/>
+          <w:rFonts w:ascii="Inter 18pt" w:hAnsi="Inter 18pt" w:cstheme="minorHAnsi"/>
+          <w:i w:val="0"/>
+          <w:iCs w:val="0"/>
+        </w:rPr>
+      </w:pPr>
+      <w:r>
+        <w:rPr>
+          <w:rStyle w:val="SubtleEmphasis"/>
+          <w:rFonts w:ascii="Inter 18pt" w:hAnsi="Inter 18pt" w:cstheme="minorHAnsi"/>
+          <w:b/>
+          <w:bCs/>
+          <w:i w:val="0"/>
+          <w:iCs w:val="0"/>
+        </w:rPr>
+        <w:t xml:space="preserve">Increased cross-platform reach by 40% </w:t>
+      </w:r>
+      <w:r>
+        <w:rPr>
+          <w:rStyle w:val="SubtleEmphasis"/>
+          <w:rFonts w:ascii="Inter 18pt" w:hAnsi="Inter 18pt" w:cstheme="minorHAnsi"/>
+          <w:i w:val="0"/>
+          <w:iCs w:val="0"/>
+        </w:rPr>
+        <w:t>through influencer/agency collaborations on viral campaigns.</w:t>
       </w:r>
     </w:p>
     <w:p>
@@ -1899,32 +1582,276 @@
         <w:pStyle w:val="ListParagraph"/>
         <w:numPr>
           <w:ilvl w:val="0"/>
-          <w:numId w:val="13"/>
+          <w:numId w:val="19"/>
         </w:numPr>
         <w:spacing w:line="276" w:lineRule="auto"/>
-        <w:ind w:right="118"/>
-        <w:rPr>
-          <w:rFonts w:ascii="Inter 18pt" w:hAnsi="Inter 18pt" w:cstheme="minorHAnsi"/>
-          <w:b/>
-          <w:bCs/>
-          <w:color w:val="404040" w:themeColor="text1" w:themeTint="BF"/>
-        </w:rPr>
-      </w:pPr>
-      <w:r>
-        <w:rPr>
-          <w:rFonts w:ascii="Inter 18pt" w:hAnsi="Inter 18pt" w:cstheme="minorHAnsi"/>
-          <w:color w:val="404040" w:themeColor="text1" w:themeTint="BF"/>
-        </w:rPr>
-        <w:t xml:space="preserve">Improved audience retention and engagement through </w:t>
-      </w:r>
-      <w:r>
-        <w:rPr>
-          <w:rFonts w:ascii="Inter 18pt" w:hAnsi="Inter 18pt" w:cstheme="minorHAnsi"/>
-          <w:b/>
-          <w:bCs/>
-          <w:color w:val="404040" w:themeColor="text1" w:themeTint="BF"/>
-        </w:rPr>
-        <w:t>hook-based storytelling and trend-driven formats.</w:t>
+        <w:ind w:right="260"/>
+        <w:rPr>
+          <w:rStyle w:val="SubtleEmphasis"/>
+          <w:rFonts w:ascii="Inter 18pt" w:hAnsi="Inter 18pt" w:cstheme="minorHAnsi"/>
+          <w:i w:val="0"/>
+          <w:iCs w:val="0"/>
+        </w:rPr>
+      </w:pPr>
+      <w:r>
+        <w:rPr>
+          <w:rFonts w:ascii="Inter 18pt" w:hAnsi="Inter 18pt" w:cstheme="minorHAnsi"/>
+          <w:b/>
+          <w:bCs/>
+          <w:color w:val="404040" w:themeColor="text1" w:themeTint="BF"/>
+        </w:rPr>
+        <w:t>Cut content fatigue by 50%</w:t>
+      </w:r>
+      <w:r>
+        <w:rPr>
+          <w:rFonts w:ascii="Inter 18pt" w:hAnsi="Inter 18pt" w:cstheme="minorHAnsi"/>
+          <w:color w:val="404040" w:themeColor="text1" w:themeTint="BF"/>
+        </w:rPr>
+        <w:t xml:space="preserve"> using A/B testing and data-driven creative pivots via Meta Business Suite.</w:t>
+      </w:r>
+    </w:p>
+    <w:p>
+      <w:pPr>
+        <w:spacing w:line="276" w:lineRule="auto"/>
+        <w:rPr>
+          <w:rStyle w:val="SubtleEmphasis"/>
+          <w:rFonts w:ascii="Inter 18pt" w:hAnsi="Inter 18pt" w:cstheme="minorHAnsi"/>
+          <w:b/>
+          <w:bCs/>
+          <w:i w:val="0"/>
+          <w:iCs w:val="0"/>
+        </w:rPr>
+      </w:pPr>
+      <w:r>
+        <w:rPr>
+          <w:rStyle w:val="SubtleEmphasis"/>
+          <w:rFonts w:ascii="Inter 18pt" w:hAnsi="Inter 18pt" w:cstheme="minorHAnsi"/>
+          <w:b/>
+          <w:bCs/>
+          <w:i w:val="0"/>
+          <w:iCs w:val="0"/>
+        </w:rPr>
+        <w:t xml:space="preserve">Creative Content Designer – Music Temple Pvt </w:t>
+      </w:r>
+      <w:r>
+        <w:rPr>
+          <w:rStyle w:val="SubtleEmphasis"/>
+          <w:rFonts w:ascii="Inter 18pt" w:hAnsi="Inter 18pt" w:cstheme="minorHAnsi"/>
+          <w:b/>
+          <w:bCs/>
+          <w:i w:val="0"/>
+          <w:iCs w:val="0"/>
+        </w:rPr>
+        <w:t>Ltd</w:t>
+      </w:r>
+      <w:r>
+        <w:rPr>
+          <w:rStyle w:val="SubtleEmphasis"/>
+          <w:rFonts w:ascii="Inter 18pt" w:hAnsi="Inter 18pt" w:cstheme="minorHAnsi"/>
+          <w:b/>
+          <w:bCs/>
+          <w:i w:val="0"/>
+          <w:iCs w:val="0"/>
+        </w:rPr>
+        <w:t>, IITM</w:t>
+      </w:r>
+      <w:r>
+        <w:rPr>
+          <w:rStyle w:val="SubtleEmphasis"/>
+          <w:rFonts w:ascii="Inter 18pt" w:hAnsi="Inter 18pt" w:cstheme="minorHAnsi"/>
+          <w:b/>
+          <w:bCs/>
+          <w:i w:val="0"/>
+          <w:iCs w:val="0"/>
+        </w:rPr>
+        <w:t>R</w:t>
+      </w:r>
+      <w:r>
+        <w:rPr>
+          <w:rStyle w:val="SubtleEmphasis"/>
+          <w:rFonts w:ascii="Inter 18pt" w:hAnsi="Inter 18pt" w:cstheme="minorHAnsi"/>
+          <w:b/>
+          <w:bCs/>
+          <w:i w:val="0"/>
+          <w:iCs w:val="0"/>
+        </w:rPr>
+        <w:t>P</w:t>
+      </w:r>
+      <w:r>
+        <w:rPr>
+          <w:rStyle w:val="SubtleEmphasis"/>
+          <w:rFonts w:ascii="Inter 18pt" w:hAnsi="Inter 18pt" w:cstheme="minorHAnsi"/>
+          <w:b/>
+          <w:bCs/>
+          <w:i w:val="0"/>
+          <w:iCs w:val="0"/>
+        </w:rPr>
+        <w:t xml:space="preserve">     </w:t>
+      </w:r>
+      <w:r>
+        <w:rPr>
+          <w:rStyle w:val="SubtleEmphasis"/>
+          <w:rFonts w:ascii="Inter 18pt" w:hAnsi="Inter 18pt" w:cstheme="minorHAnsi"/>
+          <w:b/>
+          <w:bCs/>
+          <w:i w:val="0"/>
+          <w:iCs w:val="0"/>
+        </w:rPr>
+        <w:t xml:space="preserve">  </w:t>
+      </w:r>
+      <w:r>
+        <w:rPr>
+          <w:rStyle w:val="SubtleEmphasis"/>
+          <w:rFonts w:ascii="Inter 18pt" w:hAnsi="Inter 18pt" w:cstheme="minorHAnsi"/>
+          <w:b/>
+          <w:bCs/>
+          <w:i w:val="0"/>
+          <w:iCs w:val="0"/>
+        </w:rPr>
+        <w:t xml:space="preserve">  </w:t>
+      </w:r>
+      <w:r>
+        <w:rPr>
+          <w:rStyle w:val="SubtleEmphasis"/>
+          <w:rFonts w:ascii="Inter 18pt" w:hAnsi="Inter 18pt" w:cstheme="minorHAnsi"/>
+          <w:b/>
+          <w:bCs/>
+          <w:i w:val="0"/>
+          <w:iCs w:val="0"/>
+        </w:rPr>
+        <w:t xml:space="preserve"> </w:t>
+      </w:r>
+      <w:r>
+        <w:rPr>
+          <w:rStyle w:val="SubtleEmphasis"/>
+          <w:rFonts w:ascii="Inter 18pt" w:hAnsi="Inter 18pt" w:cstheme="minorHAnsi"/>
+          <w:b/>
+          <w:bCs/>
+          <w:i w:val="0"/>
+          <w:iCs w:val="0"/>
+        </w:rPr>
+        <w:t xml:space="preserve"> </w:t>
+      </w:r>
+      <w:r>
+        <w:rPr>
+          <w:rStyle w:val="SubtleEmphasis"/>
+          <w:rFonts w:ascii="Inter 18pt" w:hAnsi="Inter 18pt" w:cstheme="minorHAnsi"/>
+          <w:b/>
+          <w:bCs/>
+          <w:i w:val="0"/>
+          <w:iCs w:val="0"/>
+        </w:rPr>
+        <w:t>Oct</w:t>
+      </w:r>
+      <w:r>
+        <w:rPr>
+          <w:rStyle w:val="SubtleEmphasis"/>
+          <w:rFonts w:ascii="Inter 18pt" w:hAnsi="Inter 18pt" w:cstheme="minorHAnsi"/>
+          <w:b/>
+          <w:bCs/>
+          <w:i w:val="0"/>
+          <w:iCs w:val="0"/>
+        </w:rPr>
+        <w:t>ober</w:t>
+      </w:r>
+      <w:r>
+        <w:rPr>
+          <w:rStyle w:val="SubtleEmphasis"/>
+          <w:rFonts w:ascii="Inter 18pt" w:hAnsi="Inter 18pt" w:cstheme="minorHAnsi"/>
+          <w:b/>
+          <w:bCs/>
+          <w:i w:val="0"/>
+          <w:iCs w:val="0"/>
+        </w:rPr>
+        <w:t xml:space="preserve"> </w:t>
+      </w:r>
+      <w:r>
+        <w:rPr>
+          <w:rStyle w:val="SubtleEmphasis"/>
+          <w:rFonts w:ascii="Inter 18pt" w:hAnsi="Inter 18pt" w:cstheme="minorHAnsi"/>
+          <w:b/>
+          <w:bCs/>
+          <w:i w:val="0"/>
+          <w:iCs w:val="0"/>
+        </w:rPr>
+        <w:t>202</w:t>
+      </w:r>
+      <w:r>
+        <w:rPr>
+          <w:rStyle w:val="SubtleEmphasis"/>
+          <w:rFonts w:ascii="Inter 18pt" w:hAnsi="Inter 18pt" w:cstheme="minorHAnsi"/>
+          <w:b/>
+          <w:bCs/>
+          <w:i w:val="0"/>
+          <w:iCs w:val="0"/>
+        </w:rPr>
+        <w:t>4</w:t>
+      </w:r>
+      <w:r>
+        <w:rPr>
+          <w:rStyle w:val="SubtleEmphasis"/>
+          <w:rFonts w:ascii="Inter 18pt" w:hAnsi="Inter 18pt" w:cstheme="minorHAnsi"/>
+          <w:b/>
+          <w:bCs/>
+          <w:i w:val="0"/>
+          <w:iCs w:val="0"/>
+        </w:rPr>
+        <w:t xml:space="preserve"> </w:t>
+      </w:r>
+      <w:r>
+        <w:rPr>
+          <w:rStyle w:val="SubtleEmphasis"/>
+          <w:rFonts w:ascii="Inter 18pt" w:hAnsi="Inter 18pt" w:cstheme="minorHAnsi"/>
+          <w:b/>
+          <w:bCs/>
+          <w:i w:val="0"/>
+          <w:iCs w:val="0"/>
+        </w:rPr>
+        <w:t>–</w:t>
+      </w:r>
+      <w:r>
+        <w:rPr>
+          <w:rStyle w:val="SubtleEmphasis"/>
+          <w:rFonts w:ascii="Inter 18pt" w:hAnsi="Inter 18pt" w:cstheme="minorHAnsi"/>
+          <w:b/>
+          <w:bCs/>
+          <w:i w:val="0"/>
+          <w:iCs w:val="0"/>
+        </w:rPr>
+        <w:t xml:space="preserve"> </w:t>
+      </w:r>
+      <w:r>
+        <w:rPr>
+          <w:rStyle w:val="SubtleEmphasis"/>
+          <w:rFonts w:ascii="Inter 18pt" w:hAnsi="Inter 18pt" w:cstheme="minorHAnsi"/>
+          <w:b/>
+          <w:bCs/>
+          <w:i w:val="0"/>
+          <w:iCs w:val="0"/>
+        </w:rPr>
+        <w:t>Nov</w:t>
+      </w:r>
+      <w:r>
+        <w:rPr>
+          <w:rStyle w:val="SubtleEmphasis"/>
+          <w:rFonts w:ascii="Inter 18pt" w:hAnsi="Inter 18pt" w:cstheme="minorHAnsi"/>
+          <w:b/>
+          <w:bCs/>
+          <w:i w:val="0"/>
+          <w:iCs w:val="0"/>
+        </w:rPr>
+        <w:t>ember</w:t>
+      </w:r>
+      <w:r>
+        <w:rPr>
+          <w:rStyle w:val="SubtleEmphasis"/>
+          <w:rFonts w:ascii="Inter 18pt" w:hAnsi="Inter 18pt" w:cstheme="minorHAnsi"/>
+          <w:b/>
+          <w:bCs/>
+          <w:i w:val="0"/>
+          <w:iCs w:val="0"/>
+        </w:rPr>
+        <w:t xml:space="preserve"> 2025</w:t>
       </w:r>
     </w:p>
     <w:p>
@@ -1932,105 +1859,29 @@
         <w:pStyle w:val="ListParagraph"/>
         <w:numPr>
           <w:ilvl w:val="0"/>
-          <w:numId w:val="13"/>
+          <w:numId w:val="20"/>
         </w:numPr>
-        <w:spacing w:line="276" w:lineRule="auto"/>
         <w:ind w:right="118"/>
         <w:rPr>
-          <w:rStyle w:val="SubtleEmphasis"/>
-          <w:i w:val="0"/>
-          <w:iCs w:val="0"/>
-        </w:rPr>
-      </w:pPr>
-      <w:r>
-        <w:rPr>
-          <w:rFonts w:ascii="Inter 18pt" w:hAnsi="Inter 18pt" w:cstheme="minorHAnsi"/>
-          <w:color w:val="404040" w:themeColor="text1" w:themeTint="BF"/>
-        </w:rPr>
-        <w:t xml:space="preserve">Contributed to </w:t>
-      </w:r>
-      <w:r>
-        <w:rPr>
-          <w:rFonts w:ascii="Inter 18pt" w:hAnsi="Inter 18pt" w:cstheme="minorHAnsi"/>
-          <w:b/>
-          <w:bCs/>
-          <w:color w:val="404040" w:themeColor="text1" w:themeTint="BF"/>
-        </w:rPr>
-        <w:t>numerous viral posts</w:t>
-      </w:r>
-      <w:r>
-        <w:rPr>
-          <w:rFonts w:ascii="Inter 18pt" w:hAnsi="Inter 18pt" w:cstheme="minorHAnsi"/>
-          <w:color w:val="404040" w:themeColor="text1" w:themeTint="BF"/>
-        </w:rPr>
-        <w:t xml:space="preserve"> as well as steady increases in interactions and reach.</w:t>
-      </w:r>
-    </w:p>
-    <w:p>
-      <w:pPr>
-        <w:ind w:right="118"/>
-        <w:rPr>
-          <w:rStyle w:val="SubtleEmphasis"/>
-          <w:i w:val="0"/>
-          <w:iCs w:val="0"/>
-        </w:rPr>
-      </w:pPr>
-    </w:p>
-    <w:p>
-      <w:pPr>
-        <w:spacing w:line="276" w:lineRule="auto"/>
-        <w:rPr>
-          <w:rStyle w:val="SubtleEmphasis"/>
-          <w:rFonts w:ascii="Inter 18pt" w:hAnsi="Inter 18pt" w:cstheme="minorHAnsi"/>
-          <w:b/>
-          <w:bCs/>
-          <w:i w:val="0"/>
-          <w:iCs w:val="0"/>
-        </w:rPr>
-      </w:pPr>
-      <w:r>
-        <w:rPr>
-          <w:rStyle w:val="SubtleEmphasis"/>
-          <w:rFonts w:ascii="Inter 18pt" w:hAnsi="Inter 18pt" w:cstheme="minorHAnsi"/>
-          <w:b/>
-          <w:bCs/>
-          <w:i w:val="0"/>
-          <w:iCs w:val="0"/>
-        </w:rPr>
-        <w:t>Content Creator – Roarr Media Pvt Ltd</w:t>
-      </w:r>
-      <w:r>
-        <w:rPr>
-          <w:rStyle w:val="SubtleEmphasis"/>
-          <w:rFonts w:ascii="Inter 18pt" w:hAnsi="Inter 18pt" w:cstheme="minorHAnsi"/>
-          <w:b/>
-          <w:bCs/>
-          <w:i w:val="0"/>
-          <w:iCs w:val="0"/>
-        </w:rPr>
-        <w:t xml:space="preserve">                                                                   Dec</w:t>
-      </w:r>
-      <w:r>
-        <w:rPr>
-          <w:rStyle w:val="SubtleEmphasis"/>
-          <w:rFonts w:ascii="Inter 18pt" w:hAnsi="Inter 18pt" w:cstheme="minorHAnsi"/>
-          <w:b/>
-          <w:bCs/>
-          <w:i w:val="0"/>
-          <w:iCs w:val="0"/>
-        </w:rPr>
-        <w:t>ember</w:t>
-      </w:r>
-      <w:r>
-        <w:rPr>
-          <w:rStyle w:val="SubtleEmphasis"/>
-          <w:rFonts w:ascii="Inter 18pt" w:hAnsi="Inter 18pt" w:cstheme="minorHAnsi"/>
-          <w:b/>
-          <w:bCs/>
-          <w:i w:val="0"/>
-          <w:iCs w:val="0"/>
-        </w:rPr>
-        <w:t xml:space="preserve"> 2025 – Present</w:t>
+          <w:rFonts w:ascii="Inter 18pt" w:hAnsi="Inter 18pt" w:cstheme="minorHAnsi"/>
+          <w:color w:val="404040" w:themeColor="text1" w:themeTint="BF"/>
+        </w:rPr>
+      </w:pPr>
+      <w:r>
+        <w:rPr>
+          <w:rFonts w:ascii="Inter 18pt" w:hAnsi="Inter 18pt" w:cstheme="minorHAnsi"/>
+          <w:b/>
+          <w:bCs/>
+          <w:color w:val="404040" w:themeColor="text1" w:themeTint="BF"/>
+        </w:rPr>
+        <w:t xml:space="preserve">Designed and produced educational content for IITM's music technology courses, </w:t>
+      </w:r>
+      <w:r>
+        <w:rPr>
+          <w:rFonts w:ascii="Inter 18pt" w:hAnsi="Inter 18pt" w:cstheme="minorHAnsi"/>
+          <w:color w:val="404040" w:themeColor="text1" w:themeTint="BF"/>
+        </w:rPr>
+        <w:t>achieving 500K+ organic views within 3 months through interactive storytelling and platform-specific formatting.</w:t>
       </w:r>
     </w:p>
     <w:p>
@@ -2038,9 +1889,8 @@
         <w:pStyle w:val="ListParagraph"/>
         <w:numPr>
           <w:ilvl w:val="0"/>
-          <w:numId w:val="14"/>
+          <w:numId w:val="20"/>
         </w:numPr>
-        <w:spacing w:line="276" w:lineRule="auto"/>
         <w:ind w:right="118"/>
         <w:rPr>
           <w:rFonts w:ascii="Inter 18pt" w:hAnsi="Inter 18pt" w:cstheme="minorHAnsi"/>
@@ -2050,9 +1900,18 @@
       <w:r>
         <w:rPr>
           <w:rFonts w:ascii="Inter 18pt" w:hAnsi="Inter 18pt" w:cstheme="minorHAnsi"/>
-          <w:color w:val="404040" w:themeColor="text1" w:themeTint="BF"/>
-        </w:rPr>
-        <w:t>Create content for many client brands on social media that is focused on performance.</w:t>
+          <w:b/>
+          <w:bCs/>
+          <w:color w:val="404040" w:themeColor="text1" w:themeTint="BF"/>
+        </w:rPr>
+        <w:t>Managed end-to-end content pipeline for IITM's music programs,</w:t>
+      </w:r>
+      <w:r>
+        <w:rPr>
+          <w:rFonts w:ascii="Inter 18pt" w:hAnsi="Inter 18pt" w:cstheme="minorHAnsi"/>
+          <w:color w:val="404040" w:themeColor="text1" w:themeTint="BF"/>
+        </w:rPr>
+        <w:t xml:space="preserve"> including scriptwriting, motion graphics (After Effects), and video editing (Premiere Pro) to simplify technical concepts for diverse audiences.</w:t>
       </w:r>
     </w:p>
     <w:p>
@@ -2060,48 +1919,29 @@
         <w:pStyle w:val="ListParagraph"/>
         <w:numPr>
           <w:ilvl w:val="0"/>
-          <w:numId w:val="14"/>
+          <w:numId w:val="20"/>
         </w:numPr>
-        <w:spacing w:line="276" w:lineRule="auto"/>
         <w:ind w:right="118"/>
         <w:rPr>
           <w:rFonts w:ascii="Inter 18pt" w:hAnsi="Inter 18pt" w:cstheme="minorHAnsi"/>
-          <w:b/>
-          <w:bCs/>
-          <w:color w:val="404040" w:themeColor="text1" w:themeTint="BF"/>
-        </w:rPr>
-      </w:pPr>
-      <w:r>
-        <w:rPr>
-          <w:rFonts w:ascii="Inter 18pt" w:hAnsi="Inter 18pt" w:cstheme="minorHAnsi"/>
-          <w:color w:val="404040" w:themeColor="text1" w:themeTint="BF"/>
-        </w:rPr>
-        <w:t xml:space="preserve">Lead the </w:t>
-      </w:r>
-      <w:r>
-        <w:rPr>
-          <w:rFonts w:ascii="Inter 18pt" w:hAnsi="Inter 18pt" w:cstheme="minorHAnsi"/>
-          <w:b/>
-          <w:bCs/>
-          <w:color w:val="404040" w:themeColor="text1" w:themeTint="BF"/>
-        </w:rPr>
-        <w:t>creative side of short-form campaigns,</w:t>
-      </w:r>
-      <w:r>
-        <w:rPr>
-          <w:rFonts w:ascii="Inter 18pt" w:hAnsi="Inter 18pt" w:cstheme="minorHAnsi"/>
-          <w:color w:val="404040" w:themeColor="text1" w:themeTint="BF"/>
-        </w:rPr>
-        <w:t xml:space="preserve"> from coming up with ideas to </w:t>
-      </w:r>
-      <w:r>
-        <w:rPr>
-          <w:rFonts w:ascii="Inter 18pt" w:hAnsi="Inter 18pt" w:cstheme="minorHAnsi"/>
-          <w:b/>
-          <w:bCs/>
-          <w:color w:val="404040" w:themeColor="text1" w:themeTint="BF"/>
-        </w:rPr>
-        <w:t>writing scripts, filming, and editing.</w:t>
+          <w:color w:val="404040" w:themeColor="text1" w:themeTint="BF"/>
+        </w:rPr>
+      </w:pPr>
+      <w:r>
+        <w:rPr>
+          <w:rFonts w:ascii="Inter 18pt" w:hAnsi="Inter 18pt" w:cstheme="minorHAnsi"/>
+          <w:b/>
+          <w:bCs/>
+          <w:color w:val="404040" w:themeColor="text1" w:themeTint="BF"/>
+        </w:rPr>
+        <w:t>Collaborated with IITM professors and music industry experts</w:t>
+      </w:r>
+      <w:r>
+        <w:rPr>
+          <w:rFonts w:ascii="Inter 18pt" w:hAnsi="Inter 18pt" w:cstheme="minorHAnsi"/>
+          <w:color w:val="404040" w:themeColor="text1" w:themeTint="BF"/>
+        </w:rPr>
+        <w:t xml:space="preserve"> to align educational content with curriculum goals and emerging trends in music production.</w:t>
       </w:r>
     </w:p>
     <w:p>
@@ -2109,9 +1949,8 @@
         <w:pStyle w:val="ListParagraph"/>
         <w:numPr>
           <w:ilvl w:val="0"/>
-          <w:numId w:val="14"/>
+          <w:numId w:val="20"/>
         </w:numPr>
-        <w:spacing w:line="276" w:lineRule="auto"/>
         <w:ind w:right="118"/>
         <w:rPr>
           <w:rFonts w:ascii="Inter 18pt" w:hAnsi="Inter 18pt" w:cstheme="minorHAnsi"/>
@@ -2121,25 +1960,18 @@
       <w:r>
         <w:rPr>
           <w:rFonts w:ascii="Inter 18pt" w:hAnsi="Inter 18pt" w:cstheme="minorHAnsi"/>
-          <w:color w:val="404040" w:themeColor="text1" w:themeTint="BF"/>
-        </w:rPr>
-        <w:t xml:space="preserve">Use </w:t>
-      </w:r>
-      <w:r>
-        <w:rPr>
-          <w:rFonts w:ascii="Inter 18pt" w:hAnsi="Inter 18pt" w:cstheme="minorHAnsi"/>
-          <w:b/>
-          <w:bCs/>
-          <w:color w:val="404040" w:themeColor="text1" w:themeTint="BF"/>
-        </w:rPr>
-        <w:t>platform analytics, audience insights, and content strategy</w:t>
-      </w:r>
-      <w:r>
-        <w:rPr>
-          <w:rFonts w:ascii="Inter 18pt" w:hAnsi="Inter 18pt" w:cstheme="minorHAnsi"/>
-          <w:color w:val="404040" w:themeColor="text1" w:themeTint="BF"/>
-        </w:rPr>
-        <w:t xml:space="preserve"> to get the most people to see and interact with your content.</w:t>
+          <w:b/>
+          <w:bCs/>
+          <w:color w:val="404040" w:themeColor="text1" w:themeTint="BF"/>
+        </w:rPr>
+        <w:t>Increased course enrolment by 25%</w:t>
+      </w:r>
+      <w:r>
+        <w:rPr>
+          <w:rFonts w:ascii="Inter 18pt" w:hAnsi="Inter 18pt" w:cstheme="minorHAnsi"/>
+          <w:color w:val="404040" w:themeColor="text1" w:themeTint="BF"/>
+        </w:rPr>
+        <w:t xml:space="preserve"> through data-driven content optimizations, including A/B testing of hooks and integrating trending audio formats.</w:t>
       </w:r>
     </w:p>
     <w:p>
@@ -2147,32 +1979,87 @@
         <w:pStyle w:val="ListParagraph"/>
         <w:numPr>
           <w:ilvl w:val="0"/>
-          <w:numId w:val="14"/>
+          <w:numId w:val="20"/>
         </w:numPr>
+        <w:ind w:right="118"/>
+        <w:rPr>
+          <w:rStyle w:val="SubtleEmphasis"/>
+          <w:i w:val="0"/>
+          <w:iCs w:val="0"/>
+        </w:rPr>
+      </w:pPr>
+      <w:r>
+        <w:rPr>
+          <w:rFonts w:ascii="Inter 18pt" w:hAnsi="Inter 18pt" w:cstheme="minorHAnsi"/>
+          <w:b/>
+          <w:bCs/>
+          <w:color w:val="404040" w:themeColor="text1" w:themeTint="BF"/>
+        </w:rPr>
+        <w:t>Created a scalable content framework for IITM's music courses</w:t>
+      </w:r>
+      <w:r>
+        <w:rPr>
+          <w:rFonts w:ascii="Inter 18pt" w:hAnsi="Inter 18pt" w:cstheme="minorHAnsi"/>
+          <w:color w:val="404040" w:themeColor="text1" w:themeTint="BF"/>
+        </w:rPr>
+        <w:t>, reducing production time by 40% while maintaining 90%+ audience retention rates.</w:t>
+      </w:r>
+    </w:p>
+    <w:p>
+      <w:pPr>
         <w:spacing w:line="276" w:lineRule="auto"/>
-        <w:ind w:right="118"/>
-        <w:rPr>
-          <w:rFonts w:ascii="Inter 18pt" w:hAnsi="Inter 18pt" w:cstheme="minorHAnsi"/>
-          <w:b/>
-          <w:bCs/>
-          <w:color w:val="404040" w:themeColor="text1" w:themeTint="BF"/>
-        </w:rPr>
-      </w:pPr>
-      <w:r>
-        <w:rPr>
-          <w:rFonts w:ascii="Inter 18pt" w:hAnsi="Inter 18pt" w:cstheme="minorHAnsi"/>
-          <w:color w:val="404040" w:themeColor="text1" w:themeTint="BF"/>
-        </w:rPr>
-        <w:t xml:space="preserve">Work closely with marketing teams to align creative output with </w:t>
-      </w:r>
-      <w:r>
-        <w:rPr>
-          <w:rFonts w:ascii="Inter 18pt" w:hAnsi="Inter 18pt" w:cstheme="minorHAnsi"/>
-          <w:b/>
-          <w:bCs/>
-          <w:color w:val="404040" w:themeColor="text1" w:themeTint="BF"/>
-        </w:rPr>
-        <w:t xml:space="preserve">brand objectives and campaign goals. </w:t>
+        <w:rPr>
+          <w:rStyle w:val="SubtleEmphasis"/>
+          <w:rFonts w:ascii="Inter 18pt" w:hAnsi="Inter 18pt" w:cstheme="minorHAnsi"/>
+          <w:b/>
+          <w:bCs/>
+          <w:i w:val="0"/>
+          <w:iCs w:val="0"/>
+        </w:rPr>
+      </w:pPr>
+      <w:r>
+        <w:rPr>
+          <w:rStyle w:val="SubtleEmphasis"/>
+          <w:rFonts w:ascii="Inter 18pt" w:hAnsi="Inter 18pt" w:cstheme="minorHAnsi"/>
+          <w:b/>
+          <w:bCs/>
+          <w:i w:val="0"/>
+          <w:iCs w:val="0"/>
+        </w:rPr>
+        <w:t>Content Creator – Roarr Media Pvt Ltd</w:t>
+      </w:r>
+      <w:r>
+        <w:rPr>
+          <w:rStyle w:val="SubtleEmphasis"/>
+          <w:rFonts w:ascii="Inter 18pt" w:hAnsi="Inter 18pt" w:cstheme="minorHAnsi"/>
+          <w:b/>
+          <w:bCs/>
+          <w:i w:val="0"/>
+          <w:iCs w:val="0"/>
+        </w:rPr>
+        <w:t xml:space="preserve">                                                                   Dec</w:t>
+      </w:r>
+      <w:r>
+        <w:rPr>
+          <w:rStyle w:val="SubtleEmphasis"/>
+          <w:rFonts w:ascii="Inter 18pt" w:hAnsi="Inter 18pt" w:cstheme="minorHAnsi"/>
+          <w:b/>
+          <w:bCs/>
+          <w:i w:val="0"/>
+          <w:iCs w:val="0"/>
+        </w:rPr>
+        <w:t>ember</w:t>
+      </w:r>
+      <w:r>
+        <w:rPr>
+          <w:rStyle w:val="SubtleEmphasis"/>
+          <w:rFonts w:ascii="Inter 18pt" w:hAnsi="Inter 18pt" w:cstheme="minorHAnsi"/>
+          <w:b/>
+          <w:bCs/>
+          <w:i w:val="0"/>
+          <w:iCs w:val="0"/>
+        </w:rPr>
+        <w:t xml:space="preserve"> 2025 – Present</w:t>
       </w:r>
     </w:p>
     <w:p>
@@ -2180,29 +2067,170 @@
         <w:pStyle w:val="ListParagraph"/>
         <w:numPr>
           <w:ilvl w:val="0"/>
-          <w:numId w:val="14"/>
+          <w:numId w:val="21"/>
         </w:numPr>
         <w:spacing w:line="276" w:lineRule="auto"/>
-        <w:ind w:right="118"/>
-        <w:rPr>
-          <w:color w:val="404040" w:themeColor="text1" w:themeTint="BF"/>
-        </w:rPr>
-      </w:pPr>
-      <w:r>
-        <w:rPr>
-          <w:rFonts w:ascii="Inter 18pt" w:hAnsi="Inter 18pt" w:cstheme="minorHAnsi"/>
-          <w:color w:val="404040" w:themeColor="text1" w:themeTint="BF"/>
-        </w:rPr>
-        <w:t xml:space="preserve">Produce scalable content formats that </w:t>
-      </w:r>
-      <w:r>
-        <w:rPr>
-          <w:rFonts w:ascii="Inter 18pt" w:hAnsi="Inter 18pt" w:cstheme="minorHAnsi"/>
-          <w:b/>
-          <w:bCs/>
-          <w:color w:val="404040" w:themeColor="text1" w:themeTint="BF"/>
-        </w:rPr>
-        <w:t>drive consistent visibility and audience growth.</w:t>
+        <w:rPr>
+          <w:rFonts w:ascii="Inter 18pt" w:hAnsi="Inter 18pt" w:cstheme="minorHAnsi"/>
+          <w:color w:val="404040" w:themeColor="text1" w:themeTint="BF"/>
+        </w:rPr>
+      </w:pPr>
+      <w:r>
+        <w:rPr>
+          <w:rFonts w:ascii="Inter 18pt" w:hAnsi="Inter 18pt" w:cstheme="minorHAnsi"/>
+          <w:color w:val="404040" w:themeColor="text1" w:themeTint="BF"/>
+        </w:rPr>
+        <w:t xml:space="preserve">Spearheaded </w:t>
+      </w:r>
+      <w:r>
+        <w:rPr>
+          <w:rFonts w:ascii="Inter 18pt" w:hAnsi="Inter 18pt" w:cstheme="minorHAnsi"/>
+          <w:b/>
+          <w:bCs/>
+          <w:color w:val="404040" w:themeColor="text1" w:themeTint="BF"/>
+        </w:rPr>
+        <w:t>end-to-end content creation</w:t>
+      </w:r>
+      <w:r>
+        <w:rPr>
+          <w:rFonts w:ascii="Inter 18pt" w:hAnsi="Inter 18pt" w:cstheme="minorHAnsi"/>
+          <w:color w:val="404040" w:themeColor="text1" w:themeTint="BF"/>
+        </w:rPr>
+        <w:t xml:space="preserve"> for Instagram and YouTube, managing the full workflow from trend research and scripting to filming, editing, and posting.</w:t>
+      </w:r>
+    </w:p>
+    <w:p>
+      <w:pPr>
+        <w:pStyle w:val="ListParagraph"/>
+        <w:numPr>
+          <w:ilvl w:val="0"/>
+          <w:numId w:val="21"/>
+        </w:numPr>
+        <w:spacing w:line="276" w:lineRule="auto"/>
+        <w:rPr>
+          <w:rFonts w:ascii="Inter 18pt" w:hAnsi="Inter 18pt" w:cstheme="minorHAnsi"/>
+          <w:color w:val="404040" w:themeColor="text1" w:themeTint="BF"/>
+        </w:rPr>
+      </w:pPr>
+      <w:r>
+        <w:rPr>
+          <w:rFonts w:ascii="Inter 18pt" w:hAnsi="Inter 18pt" w:cstheme="minorHAnsi"/>
+          <w:b/>
+          <w:bCs/>
+          <w:color w:val="404040" w:themeColor="text1" w:themeTint="BF"/>
+        </w:rPr>
+        <w:t xml:space="preserve">Led short-form campaign management </w:t>
+      </w:r>
+      <w:r>
+        <w:rPr>
+          <w:rFonts w:ascii="Inter 18pt" w:hAnsi="Inter 18pt" w:cstheme="minorHAnsi"/>
+          <w:color w:val="404040" w:themeColor="text1" w:themeTint="BF"/>
+        </w:rPr>
+        <w:t>and client meetings to align creative output with brand KPIs, resulting in millions of fully organic views.</w:t>
+      </w:r>
+    </w:p>
+    <w:p>
+      <w:pPr>
+        <w:pStyle w:val="ListParagraph"/>
+        <w:numPr>
+          <w:ilvl w:val="0"/>
+          <w:numId w:val="21"/>
+        </w:numPr>
+        <w:spacing w:line="276" w:lineRule="auto"/>
+        <w:rPr>
+          <w:rFonts w:ascii="Inter 18pt" w:hAnsi="Inter 18pt" w:cstheme="minorHAnsi"/>
+          <w:color w:val="404040" w:themeColor="text1" w:themeTint="BF"/>
+        </w:rPr>
+      </w:pPr>
+      <w:r>
+        <w:rPr>
+          <w:rFonts w:ascii="Inter 18pt" w:hAnsi="Inter 18pt" w:cstheme="minorHAnsi"/>
+          <w:b/>
+          <w:bCs/>
+          <w:color w:val="404040" w:themeColor="text1" w:themeTint="BF"/>
+        </w:rPr>
+        <w:t>Overcame algorithm volatility and content fatigue</w:t>
+      </w:r>
+      <w:r>
+        <w:rPr>
+          <w:rFonts w:ascii="Inter 18pt" w:hAnsi="Inter 18pt" w:cstheme="minorHAnsi"/>
+          <w:color w:val="404040" w:themeColor="text1" w:themeTint="BF"/>
+        </w:rPr>
+        <w:t xml:space="preserve"> by implementing a data-first approach, rebuilding content around 1-2 second hooks and faster pacing.</w:t>
+      </w:r>
+    </w:p>
+    <w:p>
+      <w:pPr>
+        <w:pStyle w:val="ListParagraph"/>
+        <w:numPr>
+          <w:ilvl w:val="0"/>
+          <w:numId w:val="21"/>
+        </w:numPr>
+        <w:spacing w:line="276" w:lineRule="auto"/>
+        <w:rPr>
+          <w:rFonts w:ascii="Inter 18pt" w:hAnsi="Inter 18pt" w:cstheme="minorHAnsi"/>
+          <w:color w:val="404040" w:themeColor="text1" w:themeTint="BF"/>
+        </w:rPr>
+      </w:pPr>
+      <w:r>
+        <w:rPr>
+          <w:rFonts w:ascii="Inter 18pt" w:hAnsi="Inter 18pt" w:cstheme="minorHAnsi"/>
+          <w:color w:val="404040" w:themeColor="text1" w:themeTint="BF"/>
+        </w:rPr>
+        <w:t xml:space="preserve">Utilized </w:t>
+      </w:r>
+      <w:r>
+        <w:rPr>
+          <w:rFonts w:ascii="Inter 18pt" w:hAnsi="Inter 18pt" w:cstheme="minorHAnsi"/>
+          <w:b/>
+          <w:bCs/>
+          <w:color w:val="404040" w:themeColor="text1" w:themeTint="BF"/>
+        </w:rPr>
+        <w:t>Adobe Premiere Pro, After Effects, Photoshop, and Illustrator</w:t>
+      </w:r>
+      <w:r>
+        <w:rPr>
+          <w:rFonts w:ascii="Inter 18pt" w:hAnsi="Inter 18pt" w:cstheme="minorHAnsi"/>
+          <w:color w:val="404040" w:themeColor="text1" w:themeTint="BF"/>
+        </w:rPr>
+        <w:t xml:space="preserve"> to diversify formats across Reels and short-form storytelling.</w:t>
+      </w:r>
+    </w:p>
+    <w:p>
+      <w:pPr>
+        <w:pStyle w:val="ListParagraph"/>
+        <w:numPr>
+          <w:ilvl w:val="0"/>
+          <w:numId w:val="21"/>
+        </w:numPr>
+        <w:spacing w:line="276" w:lineRule="auto"/>
+        <w:rPr>
+          <w:rFonts w:ascii="Inter 18pt" w:hAnsi="Inter 18pt" w:cstheme="minorHAnsi"/>
+          <w:color w:val="404040" w:themeColor="text1" w:themeTint="BF"/>
+        </w:rPr>
+      </w:pPr>
+      <w:r>
+        <w:rPr>
+          <w:rFonts w:ascii="Inter 18pt" w:hAnsi="Inter 18pt" w:cstheme="minorHAnsi"/>
+          <w:color w:val="404040" w:themeColor="text1" w:themeTint="BF"/>
+        </w:rPr>
+        <w:t xml:space="preserve">Leveraged </w:t>
+      </w:r>
+      <w:r>
+        <w:rPr>
+          <w:rFonts w:ascii="Inter 18pt" w:hAnsi="Inter 18pt" w:cstheme="minorHAnsi"/>
+          <w:b/>
+          <w:bCs/>
+          <w:color w:val="404040" w:themeColor="text1" w:themeTint="BF"/>
+        </w:rPr>
+        <w:t>trending audio and trend-timing strategies</w:t>
+      </w:r>
+      <w:r>
+        <w:rPr>
+          <w:rFonts w:ascii="Inter 18pt" w:hAnsi="Inter 18pt" w:cstheme="minorHAnsi"/>
+          <w:color w:val="404040" w:themeColor="text1" w:themeTint="BF"/>
+        </w:rPr>
+        <w:t xml:space="preserve"> to maximize organic reach and maintain high engagement rates.</w:t>
       </w:r>
     </w:p>
     <w:p>
@@ -2235,6 +2263,7 @@
           <w:szCs w:val="36"/>
           <w:u w:val="single"/>
         </w:rPr>
+        <w:lastRenderedPageBreak/>
         <w:t>LEADERSHIP EXPERIENCE</w:t>
       </w:r>
     </w:p>
@@ -2259,7 +2288,73 @@
           <w:i w:val="0"/>
           <w:iCs w:val="0"/>
         </w:rPr>
-        <w:t>Chief of Operations – TEDx Panimalar Engineering College</w:t>
+        <w:t>Chief of Operations – TEDx</w:t>
+      </w:r>
+      <w:r>
+        <w:rPr>
+          <w:rStyle w:val="SubtleEmphasis"/>
+          <w:rFonts w:ascii="Inter 18pt" w:hAnsi="Inter 18pt" w:cstheme="minorHAnsi"/>
+          <w:b/>
+          <w:bCs/>
+          <w:i w:val="0"/>
+          <w:iCs w:val="0"/>
+        </w:rPr>
+        <w:t xml:space="preserve">     </w:t>
+      </w:r>
+      <w:r>
+        <w:rPr>
+          <w:rStyle w:val="SubtleEmphasis"/>
+          <w:rFonts w:ascii="Inter 18pt" w:hAnsi="Inter 18pt" w:cstheme="minorHAnsi"/>
+          <w:b/>
+          <w:bCs/>
+          <w:i w:val="0"/>
+          <w:iCs w:val="0"/>
+        </w:rPr>
+        <w:tab/>
+      </w:r>
+      <w:r>
+        <w:rPr>
+          <w:rStyle w:val="SubtleEmphasis"/>
+          <w:rFonts w:ascii="Inter 18pt" w:hAnsi="Inter 18pt" w:cstheme="minorHAnsi"/>
+          <w:b/>
+          <w:bCs/>
+          <w:i w:val="0"/>
+          <w:iCs w:val="0"/>
+        </w:rPr>
+        <w:tab/>
+      </w:r>
+      <w:r>
+        <w:rPr>
+          <w:rStyle w:val="SubtleEmphasis"/>
+          <w:rFonts w:ascii="Inter 18pt" w:hAnsi="Inter 18pt" w:cstheme="minorHAnsi"/>
+          <w:b/>
+          <w:bCs/>
+          <w:i w:val="0"/>
+          <w:iCs w:val="0"/>
+        </w:rPr>
+        <w:tab/>
+      </w:r>
+      <w:r>
+        <w:rPr>
+          <w:rStyle w:val="SubtleEmphasis"/>
+          <w:rFonts w:ascii="Inter 18pt" w:hAnsi="Inter 18pt" w:cstheme="minorHAnsi"/>
+          <w:b/>
+          <w:bCs/>
+          <w:i w:val="0"/>
+          <w:iCs w:val="0"/>
+        </w:rPr>
+        <w:tab/>
+      </w:r>
+      <w:r>
+        <w:rPr>
+          <w:rStyle w:val="SubtleEmphasis"/>
+          <w:rFonts w:ascii="Inter 18pt" w:hAnsi="Inter 18pt" w:cstheme="minorHAnsi"/>
+          <w:b/>
+          <w:bCs/>
+          <w:i w:val="0"/>
+          <w:iCs w:val="0"/>
+        </w:rPr>
+        <w:tab/>
       </w:r>
       <w:r>
         <w:rPr>
@@ -2500,29 +2595,40 @@
           <w:i w:val="0"/>
           <w:iCs w:val="0"/>
         </w:rPr>
-        <w:t>Editorial Head – PEC Hacks (</w:t>
-      </w:r>
-      <w:r>
-        <w:rPr>
-          <w:rStyle w:val="SubtleEmphasis"/>
-          <w:rFonts w:ascii="Inter 18pt" w:hAnsi="Inter 18pt" w:cstheme="minorHAnsi"/>
-          <w:b/>
-          <w:bCs/>
-          <w:i w:val="0"/>
-          <w:iCs w:val="0"/>
-        </w:rPr>
-        <w:t>Intern</w:t>
-      </w:r>
-      <w:r>
-        <w:rPr>
-          <w:rStyle w:val="SubtleEmphasis"/>
-          <w:rFonts w:ascii="Inter 18pt" w:hAnsi="Inter 18pt" w:cstheme="minorHAnsi"/>
-          <w:b/>
-          <w:bCs/>
-          <w:i w:val="0"/>
-          <w:iCs w:val="0"/>
-        </w:rPr>
-        <w:t>ational Hackathon)</w:t>
+        <w:t xml:space="preserve">Editorial Head – PEC Hacks </w:t>
+      </w:r>
+      <w:r>
+        <w:rPr>
+          <w:rStyle w:val="SubtleEmphasis"/>
+          <w:rFonts w:ascii="Inter 18pt" w:hAnsi="Inter 18pt" w:cstheme="minorHAnsi"/>
+          <w:b/>
+          <w:bCs/>
+          <w:i w:val="0"/>
+          <w:iCs w:val="0"/>
+        </w:rPr>
+        <w:tab/>
+      </w:r>
+      <w:r>
+        <w:rPr>
+          <w:rStyle w:val="SubtleEmphasis"/>
+          <w:rFonts w:ascii="Inter 18pt" w:hAnsi="Inter 18pt" w:cstheme="minorHAnsi"/>
+          <w:b/>
+          <w:bCs/>
+          <w:i w:val="0"/>
+          <w:iCs w:val="0"/>
+        </w:rPr>
+        <w:tab/>
+      </w:r>
+      <w:r>
+        <w:rPr>
+          <w:rStyle w:val="SubtleEmphasis"/>
+          <w:rFonts w:ascii="Inter 18pt" w:hAnsi="Inter 18pt" w:cstheme="minorHAnsi"/>
+          <w:b/>
+          <w:bCs/>
+          <w:i w:val="0"/>
+          <w:iCs w:val="0"/>
+        </w:rPr>
+        <w:tab/>
       </w:r>
       <w:r>
         <w:rPr>
@@ -2798,42 +2904,15 @@
     </w:p>
     <w:p>
       <w:pPr>
-        <w:pStyle w:val="ListParagraph"/>
+        <w:pStyle w:val="Heading1"/>
         <w:spacing w:line="276" w:lineRule="auto"/>
-        <w:ind w:right="118"/>
-        <w:rPr>
-          <w:color w:val="404040" w:themeColor="text1" w:themeTint="BF"/>
-        </w:rPr>
-      </w:pPr>
-    </w:p>
-    <w:p>
-      <w:pPr>
-        <w:pStyle w:val="ListParagraph"/>
-        <w:spacing w:line="276" w:lineRule="auto"/>
-        <w:ind w:right="118"/>
-        <w:rPr>
-          <w:color w:val="404040" w:themeColor="text1" w:themeTint="BF"/>
-        </w:rPr>
-      </w:pPr>
-    </w:p>
-    <w:p>
-      <w:pPr>
-        <w:pStyle w:val="ListParagraph"/>
-        <w:spacing w:line="276" w:lineRule="auto"/>
-        <w:ind w:right="118"/>
-        <w:rPr>
-          <w:color w:val="404040" w:themeColor="text1" w:themeTint="BF"/>
-        </w:rPr>
-      </w:pPr>
-    </w:p>
-    <w:p>
-      <w:pPr>
-        <w:spacing w:line="276" w:lineRule="auto"/>
-        <w:ind w:right="118"/>
-        <w:rPr>
-          <w:rFonts w:ascii="Inter SemiBold" w:eastAsiaTheme="majorEastAsia" w:hAnsi="Inter SemiBold" w:cstheme="majorBidi"/>
-          <w:b/>
-          <w:bCs/>
+        <w:rPr>
+          <w:rStyle w:val="SubtleEmphasis"/>
+          <w:rFonts w:ascii="Inter SemiBold" w:hAnsi="Inter SemiBold"/>
+          <w:b/>
+          <w:bCs/>
+          <w:i w:val="0"/>
+          <w:iCs w:val="0"/>
           <w:color w:val="000000" w:themeColor="text1"/>
           <w:sz w:val="24"/>
           <w:szCs w:val="36"/>
@@ -2842,245 +2921,32 @@
       </w:pPr>
       <w:r>
         <w:rPr>
-          <w:rFonts w:ascii="Inter SemiBold" w:eastAsiaTheme="majorEastAsia" w:hAnsi="Inter SemiBold" w:cstheme="majorBidi"/>
-          <w:b/>
-          <w:bCs/>
+          <w:rStyle w:val="SubtleEmphasis"/>
+          <w:rFonts w:ascii="Inter SemiBold" w:hAnsi="Inter SemiBold"/>
+          <w:b/>
+          <w:bCs/>
+          <w:i w:val="0"/>
+          <w:iCs w:val="0"/>
           <w:color w:val="000000" w:themeColor="text1"/>
           <w:sz w:val="24"/>
           <w:szCs w:val="36"/>
           <w:u w:val="single"/>
         </w:rPr>
-        <w:t>KEY ACHIEVEMENTS</w:t>
-      </w:r>
-    </w:p>
-    <w:p>
-      <w:pPr>
-        <w:pStyle w:val="ListParagraph"/>
-        <w:numPr>
-          <w:ilvl w:val="0"/>
-          <w:numId w:val="17"/>
-        </w:numPr>
+        <w:t>EDUCATION</w:t>
+      </w:r>
+    </w:p>
+    <w:p>
+      <w:pPr>
         <w:spacing w:line="276" w:lineRule="auto"/>
-        <w:ind w:right="118"/>
-        <w:rPr>
-          <w:rFonts w:ascii="Inter 18pt" w:hAnsi="Inter 18pt" w:cstheme="minorHAnsi"/>
-          <w:color w:val="404040" w:themeColor="text1" w:themeTint="BF"/>
-        </w:rPr>
-      </w:pPr>
-      <w:r>
-        <w:rPr>
-          <w:rFonts w:ascii="Inter 18pt" w:hAnsi="Inter 18pt" w:cstheme="minorHAnsi"/>
-          <w:color w:val="404040" w:themeColor="text1" w:themeTint="BF"/>
-        </w:rPr>
-        <w:t xml:space="preserve">More than </w:t>
-      </w:r>
-      <w:r>
-        <w:rPr>
-          <w:rFonts w:ascii="Inter 18pt" w:hAnsi="Inter 18pt" w:cstheme="minorHAnsi"/>
-          <w:b/>
-          <w:bCs/>
-          <w:color w:val="404040" w:themeColor="text1" w:themeTint="BF"/>
-        </w:rPr>
-        <w:t>22 million organic views of viral short-form content</w:t>
-      </w:r>
-    </w:p>
-    <w:p>
-      <w:pPr>
-        <w:pStyle w:val="ListParagraph"/>
-        <w:numPr>
-          <w:ilvl w:val="0"/>
-          <w:numId w:val="17"/>
-        </w:numPr>
-        <w:spacing w:line="276" w:lineRule="auto"/>
-        <w:ind w:right="118"/>
-        <w:rPr>
-          <w:color w:val="404040" w:themeColor="text1" w:themeTint="BF"/>
-        </w:rPr>
-      </w:pPr>
-      <w:r>
-        <w:rPr>
-          <w:rFonts w:ascii="Inter 18pt" w:hAnsi="Inter 18pt" w:cstheme="minorHAnsi"/>
-          <w:color w:val="404040" w:themeColor="text1" w:themeTint="BF"/>
-        </w:rPr>
-        <w:t xml:space="preserve">Handling more than </w:t>
-      </w:r>
-      <w:r>
-        <w:rPr>
-          <w:rFonts w:ascii="Inter 18pt" w:hAnsi="Inter 18pt" w:cstheme="minorHAnsi"/>
-          <w:b/>
-          <w:bCs/>
-          <w:color w:val="404040" w:themeColor="text1" w:themeTint="BF"/>
-        </w:rPr>
-        <w:t>six expert brand accounts</w:t>
-      </w:r>
-    </w:p>
-    <w:p>
-      <w:pPr>
-        <w:pStyle w:val="ListParagraph"/>
-        <w:numPr>
-          <w:ilvl w:val="0"/>
-          <w:numId w:val="17"/>
-        </w:numPr>
-        <w:spacing w:line="276" w:lineRule="auto"/>
-        <w:ind w:right="118"/>
-        <w:rPr>
-          <w:color w:val="404040" w:themeColor="text1" w:themeTint="BF"/>
-        </w:rPr>
-      </w:pPr>
-      <w:r>
-        <w:rPr>
-          <w:rFonts w:ascii="Inter 18pt" w:hAnsi="Inter 18pt" w:cstheme="minorHAnsi"/>
-          <w:color w:val="404040" w:themeColor="text1" w:themeTint="BF"/>
-        </w:rPr>
-        <w:t xml:space="preserve">Built </w:t>
-      </w:r>
-      <w:r>
-        <w:rPr>
-          <w:rFonts w:ascii="Inter 18pt" w:hAnsi="Inter 18pt" w:cstheme="minorHAnsi"/>
-          <w:b/>
-          <w:bCs/>
-          <w:color w:val="404040" w:themeColor="text1" w:themeTint="BF"/>
-        </w:rPr>
-        <w:t xml:space="preserve">high-performing content systems </w:t>
-      </w:r>
-      <w:r>
-        <w:rPr>
-          <w:rFonts w:ascii="Inter 18pt" w:hAnsi="Inter 18pt" w:cstheme="minorHAnsi"/>
-          <w:color w:val="404040" w:themeColor="text1" w:themeTint="BF"/>
-        </w:rPr>
-        <w:t>without paid ads</w:t>
-      </w:r>
-      <w:r>
-        <w:rPr>
-          <w:rFonts w:ascii="Inter 18pt" w:hAnsi="Inter 18pt" w:cstheme="minorHAnsi"/>
-          <w:color w:val="404040" w:themeColor="text1" w:themeTint="BF"/>
-        </w:rPr>
-        <w:t xml:space="preserve"> </w:t>
-      </w:r>
-    </w:p>
-    <w:p>
-      <w:pPr>
-        <w:pStyle w:val="ListParagraph"/>
-        <w:numPr>
-          <w:ilvl w:val="0"/>
-          <w:numId w:val="17"/>
-        </w:numPr>
-        <w:spacing w:line="276" w:lineRule="auto"/>
-        <w:ind w:right="118"/>
-        <w:rPr>
-          <w:color w:val="404040" w:themeColor="text1" w:themeTint="BF"/>
-        </w:rPr>
-      </w:pPr>
-      <w:r>
-        <w:rPr>
-          <w:rFonts w:ascii="Inter 18pt" w:hAnsi="Inter 18pt" w:cstheme="minorHAnsi"/>
-          <w:color w:val="404040" w:themeColor="text1" w:themeTint="BF"/>
-        </w:rPr>
-        <w:t xml:space="preserve">Directed </w:t>
-      </w:r>
-      <w:r>
-        <w:rPr>
-          <w:rFonts w:ascii="Inter 18pt" w:hAnsi="Inter 18pt" w:cstheme="minorHAnsi"/>
-          <w:b/>
-          <w:bCs/>
-          <w:color w:val="404040" w:themeColor="text1" w:themeTint="BF"/>
-        </w:rPr>
-        <w:t>inter</w:t>
-      </w:r>
-      <w:r>
-        <w:rPr>
-          <w:rFonts w:ascii="Inter 18pt" w:hAnsi="Inter 18pt" w:cstheme="minorHAnsi"/>
-          <w:b/>
-          <w:bCs/>
-          <w:color w:val="404040" w:themeColor="text1" w:themeTint="BF"/>
-        </w:rPr>
-        <w:t xml:space="preserve">national event branding and promotion </w:t>
-      </w:r>
-    </w:p>
-    <w:p>
-      <w:pPr>
-        <w:pStyle w:val="ListParagraph"/>
-        <w:numPr>
-          <w:ilvl w:val="0"/>
-          <w:numId w:val="17"/>
-        </w:numPr>
-        <w:spacing w:line="276" w:lineRule="auto"/>
-        <w:ind w:right="118"/>
-        <w:rPr>
-          <w:color w:val="404040" w:themeColor="text1" w:themeTint="BF"/>
-        </w:rPr>
-      </w:pPr>
-      <w:r>
-        <w:rPr>
-          <w:rFonts w:ascii="Inter 18pt" w:hAnsi="Inter 18pt" w:cstheme="minorHAnsi"/>
-          <w:color w:val="404040" w:themeColor="text1" w:themeTint="BF"/>
-        </w:rPr>
-        <w:t xml:space="preserve">Produced </w:t>
-      </w:r>
-      <w:r>
-        <w:rPr>
-          <w:rFonts w:ascii="Inter 18pt" w:hAnsi="Inter 18pt" w:cstheme="minorHAnsi"/>
-          <w:b/>
-          <w:bCs/>
-          <w:color w:val="404040" w:themeColor="text1" w:themeTint="BF"/>
-        </w:rPr>
-        <w:t>performance-driven creative work</w:t>
-      </w:r>
-      <w:r>
-        <w:rPr>
-          <w:rFonts w:ascii="Inter 18pt" w:hAnsi="Inter 18pt" w:cstheme="minorHAnsi"/>
-          <w:color w:val="404040" w:themeColor="text1" w:themeTint="BF"/>
-        </w:rPr>
-        <w:t xml:space="preserve"> on a regular basis</w:t>
-      </w:r>
-    </w:p>
-    <w:p>
-      <w:pPr>
-        <w:pStyle w:val="Heading1"/>
-        <w:spacing w:line="276" w:lineRule="auto"/>
-        <w:rPr>
-          <w:rStyle w:val="SubtleEmphasis"/>
-          <w:rFonts w:ascii="Inter SemiBold" w:hAnsi="Inter SemiBold"/>
-          <w:b/>
-          <w:bCs/>
-          <w:i w:val="0"/>
-          <w:iCs w:val="0"/>
-          <w:color w:val="000000" w:themeColor="text1"/>
-          <w:sz w:val="24"/>
-          <w:szCs w:val="36"/>
-          <w:u w:val="single"/>
-        </w:rPr>
-      </w:pPr>
-      <w:r>
-        <w:rPr>
-          <w:rStyle w:val="SubtleEmphasis"/>
-          <w:rFonts w:ascii="Inter SemiBold" w:hAnsi="Inter SemiBold"/>
-          <w:b/>
-          <w:bCs/>
-          <w:i w:val="0"/>
-          <w:iCs w:val="0"/>
-          <w:color w:val="000000" w:themeColor="text1"/>
-          <w:sz w:val="24"/>
-          <w:szCs w:val="36"/>
-          <w:u w:val="single"/>
-        </w:rPr>
-        <w:t>EDUCATION</w:t>
-      </w:r>
-    </w:p>
-    <w:p>
-      <w:pPr>
-        <w:spacing w:line="276" w:lineRule="auto"/>
-        <w:rPr>
-          <w:rStyle w:val="SubtleEmphasis"/>
-          <w:rFonts w:ascii="Inter 18pt" w:hAnsi="Inter 18pt" w:cstheme="minorHAnsi"/>
-          <w:b/>
-          <w:bCs/>
-          <w:i w:val="0"/>
-          <w:iCs w:val="0"/>
-        </w:rPr>
-      </w:pPr>
-      <w:proofErr w:type="spellStart"/>
-      <w:proofErr w:type="gramStart"/>
+        <w:rPr>
+          <w:rStyle w:val="SubtleEmphasis"/>
+          <w:rFonts w:ascii="Inter 18pt" w:hAnsi="Inter 18pt" w:cstheme="minorHAnsi"/>
+          <w:b/>
+          <w:bCs/>
+          <w:i w:val="0"/>
+          <w:iCs w:val="0"/>
+        </w:rPr>
+      </w:pPr>
       <w:r>
         <w:rPr>
           <w:rStyle w:val="SubtleEmphasis"/>
@@ -3112,20 +2978,7 @@
           <w:i w:val="0"/>
           <w:iCs w:val="0"/>
         </w:rPr>
-        <w:t>Tech</w:t>
-      </w:r>
-      <w:proofErr w:type="spellEnd"/>
-      <w:proofErr w:type="gramEnd"/>
-      <w:r>
-        <w:rPr>
-          <w:rStyle w:val="SubtleEmphasis"/>
-          <w:rFonts w:ascii="Inter 18pt" w:hAnsi="Inter 18pt" w:cstheme="minorHAnsi"/>
-          <w:b/>
-          <w:bCs/>
-          <w:i w:val="0"/>
-          <w:iCs w:val="0"/>
-        </w:rPr>
-        <w:t xml:space="preserve"> – Computer Science &amp; Business Systems</w:t>
+        <w:t>Tech – Computer Science &amp; Business Systems</w:t>
       </w:r>
       <w:r>
         <w:rPr>
@@ -3353,17 +3206,8 @@
           <w:rFonts w:ascii="Inter 18pt" w:hAnsi="Inter 18pt" w:cstheme="minorHAnsi"/>
           <w:color w:val="404040" w:themeColor="text1" w:themeTint="BF"/>
         </w:rPr>
-        <w:t xml:space="preserve">: Noyal Surya J </w:t>
-      </w:r>
-      <w:proofErr w:type="spellStart"/>
-      <w:r>
-        <w:rPr>
-          <w:rFonts w:ascii="Inter 18pt" w:hAnsi="Inter 18pt" w:cstheme="minorHAnsi"/>
-          <w:color w:val="404040" w:themeColor="text1" w:themeTint="BF"/>
-        </w:rPr>
-        <w:t>J</w:t>
-      </w:r>
-      <w:proofErr w:type="spellEnd"/>
+        <w:t>: Noyal Surya J J</w:t>
+      </w:r>
     </w:p>
     <w:p>
       <w:pPr>
@@ -3642,23 +3486,7 @@
           <w:rFonts w:ascii="Inter 18pt" w:hAnsi="Inter 18pt" w:cstheme="minorHAnsi"/>
           <w:color w:val="404040" w:themeColor="text1" w:themeTint="BF"/>
         </w:rPr>
-        <w:t xml:space="preserve">Noyal Surya J </w:t>
-      </w:r>
-      <w:proofErr w:type="spellStart"/>
-      <w:r>
-        <w:rPr>
-          <w:rFonts w:ascii="Inter 18pt" w:hAnsi="Inter 18pt" w:cstheme="minorHAnsi"/>
-          <w:color w:val="404040" w:themeColor="text1" w:themeTint="BF"/>
-        </w:rPr>
-        <w:t>J</w:t>
-      </w:r>
-      <w:proofErr w:type="spellEnd"/>
-      <w:r>
-        <w:rPr>
-          <w:rFonts w:ascii="Inter 18pt" w:hAnsi="Inter 18pt" w:cstheme="minorHAnsi"/>
-          <w:color w:val="404040" w:themeColor="text1" w:themeTint="BF"/>
-        </w:rPr>
-        <w:t xml:space="preserve">, </w:t>
+        <w:t xml:space="preserve">Noyal Surya J J, </w:t>
       </w:r>
       <w:r>
         <w:rPr>
@@ -3780,17 +3608,6 @@
         </w:rPr>
         <w:t>)</w:t>
       </w:r>
-    </w:p>
-    <w:p>
-      <w:pPr>
-        <w:spacing w:line="276" w:lineRule="auto"/>
-        <w:ind w:right="118"/>
-        <w:rPr>
-          <w:rStyle w:val="SubtleEmphasis"/>
-          <w:i w:val="0"/>
-          <w:iCs w:val="0"/>
-        </w:rPr>
-      </w:pPr>
     </w:p>
     <w:p>
       <w:pPr>
@@ -4511,6 +4328,119 @@
     </w:lvl>
   </w:abstractNum>
   <w:abstractNum w:abstractNumId="6" w15:restartNumberingAfterBreak="0">
+    <w:nsid w:val="1D7E228A"/>
+    <w:multiLevelType w:val="hybridMultilevel"/>
+    <w:tmpl w:val="A0882DE0"/>
+    <w:lvl w:ilvl="0" w:tplc="D71CE87C">
+      <w:start w:val="1"/>
+      <w:numFmt w:val="bullet"/>
+      <w:lvlText w:val=""/>
+      <w:lvlJc w:val="left"/>
+      <w:pPr>
+        <w:ind w:left="720" w:hanging="360"/>
+      </w:pPr>
+      <w:rPr>
+        <w:rFonts w:ascii="Symbol" w:hAnsi="Symbol" w:hint="default"/>
+      </w:rPr>
+    </w:lvl>
+    <w:lvl w:ilvl="1" w:tplc="40090003" w:tentative="1">
+      <w:start w:val="1"/>
+      <w:numFmt w:val="bullet"/>
+      <w:lvlText w:val="o"/>
+      <w:lvlJc w:val="left"/>
+      <w:pPr>
+        <w:ind w:left="1440" w:hanging="360"/>
+      </w:pPr>
+      <w:rPr>
+        <w:rFonts w:ascii="Courier New" w:hAnsi="Courier New" w:cs="Courier New" w:hint="default"/>
+      </w:rPr>
+    </w:lvl>
+    <w:lvl w:ilvl="2" w:tplc="40090005" w:tentative="1">
+      <w:start w:val="1"/>
+      <w:numFmt w:val="bullet"/>
+      <w:lvlText w:val=""/>
+      <w:lvlJc w:val="left"/>
+      <w:pPr>
+        <w:ind w:left="2160" w:hanging="360"/>
+      </w:pPr>
+      <w:rPr>
+        <w:rFonts w:ascii="Wingdings" w:hAnsi="Wingdings" w:hint="default"/>
+      </w:rPr>
+    </w:lvl>
+    <w:lvl w:ilvl="3" w:tplc="40090001" w:tentative="1">
+      <w:start w:val="1"/>
+      <w:numFmt w:val="bullet"/>
+      <w:lvlText w:val=""/>
+      <w:lvlJc w:val="left"/>
+      <w:pPr>
+        <w:ind w:left="2880" w:hanging="360"/>
+      </w:pPr>
+      <w:rPr>
+        <w:rFonts w:ascii="Symbol" w:hAnsi="Symbol" w:hint="default"/>
+      </w:rPr>
+    </w:lvl>
+    <w:lvl w:ilvl="4" w:tplc="40090003" w:tentative="1">
+      <w:start w:val="1"/>
+      <w:numFmt w:val="bullet"/>
+      <w:lvlText w:val="o"/>
+      <w:lvlJc w:val="left"/>
+      <w:pPr>
+        <w:ind w:left="3600" w:hanging="360"/>
+      </w:pPr>
+      <w:rPr>
+        <w:rFonts w:ascii="Courier New" w:hAnsi="Courier New" w:cs="Courier New" w:hint="default"/>
+      </w:rPr>
+    </w:lvl>
+    <w:lvl w:ilvl="5" w:tplc="40090005" w:tentative="1">
+      <w:start w:val="1"/>
+      <w:numFmt w:val="bullet"/>
+      <w:lvlText w:val=""/>
+      <w:lvlJc w:val="left"/>
+      <w:pPr>
+        <w:ind w:left="4320" w:hanging="360"/>
+      </w:pPr>
+      <w:rPr>
+        <w:rFonts w:ascii="Wingdings" w:hAnsi="Wingdings" w:hint="default"/>
+      </w:rPr>
+    </w:lvl>
+    <w:lvl w:ilvl="6" w:tplc="40090001" w:tentative="1">
+      <w:start w:val="1"/>
+      <w:numFmt w:val="bullet"/>
+      <w:lvlText w:val=""/>
+      <w:lvlJc w:val="left"/>
+      <w:pPr>
+        <w:ind w:left="5040" w:hanging="360"/>
+      </w:pPr>
+      <w:rPr>
+        <w:rFonts w:ascii="Symbol" w:hAnsi="Symbol" w:hint="default"/>
+      </w:rPr>
+    </w:lvl>
+    <w:lvl w:ilvl="7" w:tplc="40090003" w:tentative="1">
+      <w:start w:val="1"/>
+      <w:numFmt w:val="bullet"/>
+      <w:lvlText w:val="o"/>
+      <w:lvlJc w:val="left"/>
+      <w:pPr>
+        <w:ind w:left="5760" w:hanging="360"/>
+      </w:pPr>
+      <w:rPr>
+        <w:rFonts w:ascii="Courier New" w:hAnsi="Courier New" w:cs="Courier New" w:hint="default"/>
+      </w:rPr>
+    </w:lvl>
+    <w:lvl w:ilvl="8" w:tplc="40090005" w:tentative="1">
+      <w:start w:val="1"/>
+      <w:numFmt w:val="bullet"/>
+      <w:lvlText w:val=""/>
+      <w:lvlJc w:val="left"/>
+      <w:pPr>
+        <w:ind w:left="6480" w:hanging="360"/>
+      </w:pPr>
+      <w:rPr>
+        <w:rFonts w:ascii="Wingdings" w:hAnsi="Wingdings" w:hint="default"/>
+      </w:rPr>
+    </w:lvl>
+  </w:abstractNum>
+  <w:abstractNum w:abstractNumId="7" w15:restartNumberingAfterBreak="0">
     <w:nsid w:val="21EE5370"/>
     <w:multiLevelType w:val="hybridMultilevel"/>
     <w:tmpl w:val="8268410C"/>
@@ -4623,7 +4553,7 @@
       </w:rPr>
     </w:lvl>
   </w:abstractNum>
-  <w:abstractNum w:abstractNumId="7" w15:restartNumberingAfterBreak="0">
+  <w:abstractNum w:abstractNumId="8" w15:restartNumberingAfterBreak="0">
     <w:nsid w:val="222F1095"/>
     <w:multiLevelType w:val="hybridMultilevel"/>
     <w:tmpl w:val="39ACEAF4"/>
@@ -4735,7 +4665,7 @@
       </w:rPr>
     </w:lvl>
   </w:abstractNum>
-  <w:abstractNum w:abstractNumId="8" w15:restartNumberingAfterBreak="0">
+  <w:abstractNum w:abstractNumId="9" w15:restartNumberingAfterBreak="0">
     <w:nsid w:val="2AF8305D"/>
     <w:multiLevelType w:val="hybridMultilevel"/>
     <w:tmpl w:val="47E0DA48"/>
@@ -4848,7 +4778,233 @@
       </w:rPr>
     </w:lvl>
   </w:abstractNum>
-  <w:abstractNum w:abstractNumId="9" w15:restartNumberingAfterBreak="0">
+  <w:abstractNum w:abstractNumId="10" w15:restartNumberingAfterBreak="0">
+    <w:nsid w:val="3A9E0F71"/>
+    <w:multiLevelType w:val="hybridMultilevel"/>
+    <w:tmpl w:val="317479C2"/>
+    <w:lvl w:ilvl="0" w:tplc="D71CE87C">
+      <w:start w:val="1"/>
+      <w:numFmt w:val="bullet"/>
+      <w:lvlText w:val=""/>
+      <w:lvlJc w:val="left"/>
+      <w:pPr>
+        <w:ind w:left="720" w:hanging="360"/>
+      </w:pPr>
+      <w:rPr>
+        <w:rFonts w:ascii="Symbol" w:hAnsi="Symbol" w:hint="default"/>
+      </w:rPr>
+    </w:lvl>
+    <w:lvl w:ilvl="1" w:tplc="40090003" w:tentative="1">
+      <w:start w:val="1"/>
+      <w:numFmt w:val="bullet"/>
+      <w:lvlText w:val="o"/>
+      <w:lvlJc w:val="left"/>
+      <w:pPr>
+        <w:ind w:left="1440" w:hanging="360"/>
+      </w:pPr>
+      <w:rPr>
+        <w:rFonts w:ascii="Courier New" w:hAnsi="Courier New" w:cs="Courier New" w:hint="default"/>
+      </w:rPr>
+    </w:lvl>
+    <w:lvl w:ilvl="2" w:tplc="40090005" w:tentative="1">
+      <w:start w:val="1"/>
+      <w:numFmt w:val="bullet"/>
+      <w:lvlText w:val=""/>
+      <w:lvlJc w:val="left"/>
+      <w:pPr>
+        <w:ind w:left="2160" w:hanging="360"/>
+      </w:pPr>
+      <w:rPr>
+        <w:rFonts w:ascii="Wingdings" w:hAnsi="Wingdings" w:hint="default"/>
+      </w:rPr>
+    </w:lvl>
+    <w:lvl w:ilvl="3" w:tplc="40090001" w:tentative="1">
+      <w:start w:val="1"/>
+      <w:numFmt w:val="bullet"/>
+      <w:lvlText w:val=""/>
+      <w:lvlJc w:val="left"/>
+      <w:pPr>
+        <w:ind w:left="2880" w:hanging="360"/>
+      </w:pPr>
+      <w:rPr>
+        <w:rFonts w:ascii="Symbol" w:hAnsi="Symbol" w:hint="default"/>
+      </w:rPr>
+    </w:lvl>
+    <w:lvl w:ilvl="4" w:tplc="40090003" w:tentative="1">
+      <w:start w:val="1"/>
+      <w:numFmt w:val="bullet"/>
+      <w:lvlText w:val="o"/>
+      <w:lvlJc w:val="left"/>
+      <w:pPr>
+        <w:ind w:left="3600" w:hanging="360"/>
+      </w:pPr>
+      <w:rPr>
+        <w:rFonts w:ascii="Courier New" w:hAnsi="Courier New" w:cs="Courier New" w:hint="default"/>
+      </w:rPr>
+    </w:lvl>
+    <w:lvl w:ilvl="5" w:tplc="40090005" w:tentative="1">
+      <w:start w:val="1"/>
+      <w:numFmt w:val="bullet"/>
+      <w:lvlText w:val=""/>
+      <w:lvlJc w:val="left"/>
+      <w:pPr>
+        <w:ind w:left="4320" w:hanging="360"/>
+      </w:pPr>
+      <w:rPr>
+        <w:rFonts w:ascii="Wingdings" w:hAnsi="Wingdings" w:hint="default"/>
+      </w:rPr>
+    </w:lvl>
+    <w:lvl w:ilvl="6" w:tplc="40090001" w:tentative="1">
+      <w:start w:val="1"/>
+      <w:numFmt w:val="bullet"/>
+      <w:lvlText w:val=""/>
+      <w:lvlJc w:val="left"/>
+      <w:pPr>
+        <w:ind w:left="5040" w:hanging="360"/>
+      </w:pPr>
+      <w:rPr>
+        <w:rFonts w:ascii="Symbol" w:hAnsi="Symbol" w:hint="default"/>
+      </w:rPr>
+    </w:lvl>
+    <w:lvl w:ilvl="7" w:tplc="40090003" w:tentative="1">
+      <w:start w:val="1"/>
+      <w:numFmt w:val="bullet"/>
+      <w:lvlText w:val="o"/>
+      <w:lvlJc w:val="left"/>
+      <w:pPr>
+        <w:ind w:left="5760" w:hanging="360"/>
+      </w:pPr>
+      <w:rPr>
+        <w:rFonts w:ascii="Courier New" w:hAnsi="Courier New" w:cs="Courier New" w:hint="default"/>
+      </w:rPr>
+    </w:lvl>
+    <w:lvl w:ilvl="8" w:tplc="40090005" w:tentative="1">
+      <w:start w:val="1"/>
+      <w:numFmt w:val="bullet"/>
+      <w:lvlText w:val=""/>
+      <w:lvlJc w:val="left"/>
+      <w:pPr>
+        <w:ind w:left="6480" w:hanging="360"/>
+      </w:pPr>
+      <w:rPr>
+        <w:rFonts w:ascii="Wingdings" w:hAnsi="Wingdings" w:hint="default"/>
+      </w:rPr>
+    </w:lvl>
+  </w:abstractNum>
+  <w:abstractNum w:abstractNumId="11" w15:restartNumberingAfterBreak="0">
+    <w:nsid w:val="3CD27806"/>
+    <w:multiLevelType w:val="hybridMultilevel"/>
+    <w:tmpl w:val="BA5C0D84"/>
+    <w:lvl w:ilvl="0" w:tplc="D71CE87C">
+      <w:start w:val="1"/>
+      <w:numFmt w:val="bullet"/>
+      <w:lvlText w:val=""/>
+      <w:lvlJc w:val="left"/>
+      <w:pPr>
+        <w:ind w:left="720" w:hanging="360"/>
+      </w:pPr>
+      <w:rPr>
+        <w:rFonts w:ascii="Symbol" w:hAnsi="Symbol" w:hint="default"/>
+      </w:rPr>
+    </w:lvl>
+    <w:lvl w:ilvl="1" w:tplc="40090003" w:tentative="1">
+      <w:start w:val="1"/>
+      <w:numFmt w:val="bullet"/>
+      <w:lvlText w:val="o"/>
+      <w:lvlJc w:val="left"/>
+      <w:pPr>
+        <w:ind w:left="1440" w:hanging="360"/>
+      </w:pPr>
+      <w:rPr>
+        <w:rFonts w:ascii="Courier New" w:hAnsi="Courier New" w:cs="Courier New" w:hint="default"/>
+      </w:rPr>
+    </w:lvl>
+    <w:lvl w:ilvl="2" w:tplc="40090005" w:tentative="1">
+      <w:start w:val="1"/>
+      <w:numFmt w:val="bullet"/>
+      <w:lvlText w:val=""/>
+      <w:lvlJc w:val="left"/>
+      <w:pPr>
+        <w:ind w:left="2160" w:hanging="360"/>
+      </w:pPr>
+      <w:rPr>
+        <w:rFonts w:ascii="Wingdings" w:hAnsi="Wingdings" w:hint="default"/>
+      </w:rPr>
+    </w:lvl>
+    <w:lvl w:ilvl="3" w:tplc="40090001" w:tentative="1">
+      <w:start w:val="1"/>
+      <w:numFmt w:val="bullet"/>
+      <w:lvlText w:val=""/>
+      <w:lvlJc w:val="left"/>
+      <w:pPr>
+        <w:ind w:left="2880" w:hanging="360"/>
+      </w:pPr>
+      <w:rPr>
+        <w:rFonts w:ascii="Symbol" w:hAnsi="Symbol" w:hint="default"/>
+      </w:rPr>
+    </w:lvl>
+    <w:lvl w:ilvl="4" w:tplc="40090003" w:tentative="1">
+      <w:start w:val="1"/>
+      <w:numFmt w:val="bullet"/>
+      <w:lvlText w:val="o"/>
+      <w:lvlJc w:val="left"/>
+      <w:pPr>
+        <w:ind w:left="3600" w:hanging="360"/>
+      </w:pPr>
+      <w:rPr>
+        <w:rFonts w:ascii="Courier New" w:hAnsi="Courier New" w:cs="Courier New" w:hint="default"/>
+      </w:rPr>
+    </w:lvl>
+    <w:lvl w:ilvl="5" w:tplc="40090005" w:tentative="1">
+      <w:start w:val="1"/>
+      <w:numFmt w:val="bullet"/>
+      <w:lvlText w:val=""/>
+      <w:lvlJc w:val="left"/>
+      <w:pPr>
+        <w:ind w:left="4320" w:hanging="360"/>
+      </w:pPr>
+      <w:rPr>
+        <w:rFonts w:ascii="Wingdings" w:hAnsi="Wingdings" w:hint="default"/>
+      </w:rPr>
+    </w:lvl>
+    <w:lvl w:ilvl="6" w:tplc="40090001" w:tentative="1">
+      <w:start w:val="1"/>
+      <w:numFmt w:val="bullet"/>
+      <w:lvlText w:val=""/>
+      <w:lvlJc w:val="left"/>
+      <w:pPr>
+        <w:ind w:left="5040" w:hanging="360"/>
+      </w:pPr>
+      <w:rPr>
+        <w:rFonts w:ascii="Symbol" w:hAnsi="Symbol" w:hint="default"/>
+      </w:rPr>
+    </w:lvl>
+    <w:lvl w:ilvl="7" w:tplc="40090003" w:tentative="1">
+      <w:start w:val="1"/>
+      <w:numFmt w:val="bullet"/>
+      <w:lvlText w:val="o"/>
+      <w:lvlJc w:val="left"/>
+      <w:pPr>
+        <w:ind w:left="5760" w:hanging="360"/>
+      </w:pPr>
+      <w:rPr>
+        <w:rFonts w:ascii="Courier New" w:hAnsi="Courier New" w:cs="Courier New" w:hint="default"/>
+      </w:rPr>
+    </w:lvl>
+    <w:lvl w:ilvl="8" w:tplc="40090005" w:tentative="1">
+      <w:start w:val="1"/>
+      <w:numFmt w:val="bullet"/>
+      <w:lvlText w:val=""/>
+      <w:lvlJc w:val="left"/>
+      <w:pPr>
+        <w:ind w:left="6480" w:hanging="360"/>
+      </w:pPr>
+      <w:rPr>
+        <w:rFonts w:ascii="Wingdings" w:hAnsi="Wingdings" w:hint="default"/>
+      </w:rPr>
+    </w:lvl>
+  </w:abstractNum>
+  <w:abstractNum w:abstractNumId="12" w15:restartNumberingAfterBreak="0">
     <w:nsid w:val="41DF446F"/>
     <w:multiLevelType w:val="hybridMultilevel"/>
     <w:tmpl w:val="4D46EB7E"/>
@@ -4961,7 +5117,7 @@
       </w:rPr>
     </w:lvl>
   </w:abstractNum>
-  <w:abstractNum w:abstractNumId="10" w15:restartNumberingAfterBreak="0">
+  <w:abstractNum w:abstractNumId="13" w15:restartNumberingAfterBreak="0">
     <w:nsid w:val="48022C88"/>
     <w:multiLevelType w:val="hybridMultilevel"/>
     <w:tmpl w:val="886E4EBA"/>
@@ -5074,7 +5230,120 @@
       </w:rPr>
     </w:lvl>
   </w:abstractNum>
-  <w:abstractNum w:abstractNumId="11" w15:restartNumberingAfterBreak="0">
+  <w:abstractNum w:abstractNumId="14" w15:restartNumberingAfterBreak="0">
+    <w:nsid w:val="51A61D5B"/>
+    <w:multiLevelType w:val="hybridMultilevel"/>
+    <w:tmpl w:val="DC902D04"/>
+    <w:lvl w:ilvl="0" w:tplc="D71CE87C">
+      <w:start w:val="1"/>
+      <w:numFmt w:val="bullet"/>
+      <w:lvlText w:val=""/>
+      <w:lvlJc w:val="left"/>
+      <w:pPr>
+        <w:ind w:left="720" w:hanging="360"/>
+      </w:pPr>
+      <w:rPr>
+        <w:rFonts w:ascii="Symbol" w:hAnsi="Symbol" w:hint="default"/>
+      </w:rPr>
+    </w:lvl>
+    <w:lvl w:ilvl="1" w:tplc="40090003" w:tentative="1">
+      <w:start w:val="1"/>
+      <w:numFmt w:val="bullet"/>
+      <w:lvlText w:val="o"/>
+      <w:lvlJc w:val="left"/>
+      <w:pPr>
+        <w:ind w:left="1440" w:hanging="360"/>
+      </w:pPr>
+      <w:rPr>
+        <w:rFonts w:ascii="Courier New" w:hAnsi="Courier New" w:cs="Courier New" w:hint="default"/>
+      </w:rPr>
+    </w:lvl>
+    <w:lvl w:ilvl="2" w:tplc="40090005" w:tentative="1">
+      <w:start w:val="1"/>
+      <w:numFmt w:val="bullet"/>
+      <w:lvlText w:val=""/>
+      <w:lvlJc w:val="left"/>
+      <w:pPr>
+        <w:ind w:left="2160" w:hanging="360"/>
+      </w:pPr>
+      <w:rPr>
+        <w:rFonts w:ascii="Wingdings" w:hAnsi="Wingdings" w:hint="default"/>
+      </w:rPr>
+    </w:lvl>
+    <w:lvl w:ilvl="3" w:tplc="40090001" w:tentative="1">
+      <w:start w:val="1"/>
+      <w:numFmt w:val="bullet"/>
+      <w:lvlText w:val=""/>
+      <w:lvlJc w:val="left"/>
+      <w:pPr>
+        <w:ind w:left="2880" w:hanging="360"/>
+      </w:pPr>
+      <w:rPr>
+        <w:rFonts w:ascii="Symbol" w:hAnsi="Symbol" w:hint="default"/>
+      </w:rPr>
+    </w:lvl>
+    <w:lvl w:ilvl="4" w:tplc="40090003" w:tentative="1">
+      <w:start w:val="1"/>
+      <w:numFmt w:val="bullet"/>
+      <w:lvlText w:val="o"/>
+      <w:lvlJc w:val="left"/>
+      <w:pPr>
+        <w:ind w:left="3600" w:hanging="360"/>
+      </w:pPr>
+      <w:rPr>
+        <w:rFonts w:ascii="Courier New" w:hAnsi="Courier New" w:cs="Courier New" w:hint="default"/>
+      </w:rPr>
+    </w:lvl>
+    <w:lvl w:ilvl="5" w:tplc="40090005" w:tentative="1">
+      <w:start w:val="1"/>
+      <w:numFmt w:val="bullet"/>
+      <w:lvlText w:val=""/>
+      <w:lvlJc w:val="left"/>
+      <w:pPr>
+        <w:ind w:left="4320" w:hanging="360"/>
+      </w:pPr>
+      <w:rPr>
+        <w:rFonts w:ascii="Wingdings" w:hAnsi="Wingdings" w:hint="default"/>
+      </w:rPr>
+    </w:lvl>
+    <w:lvl w:ilvl="6" w:tplc="40090001" w:tentative="1">
+      <w:start w:val="1"/>
+      <w:numFmt w:val="bullet"/>
+      <w:lvlText w:val=""/>
+      <w:lvlJc w:val="left"/>
+      <w:pPr>
+        <w:ind w:left="5040" w:hanging="360"/>
+      </w:pPr>
+      <w:rPr>
+        <w:rFonts w:ascii="Symbol" w:hAnsi="Symbol" w:hint="default"/>
+      </w:rPr>
+    </w:lvl>
+    <w:lvl w:ilvl="7" w:tplc="40090003" w:tentative="1">
+      <w:start w:val="1"/>
+      <w:numFmt w:val="bullet"/>
+      <w:lvlText w:val="o"/>
+      <w:lvlJc w:val="left"/>
+      <w:pPr>
+        <w:ind w:left="5760" w:hanging="360"/>
+      </w:pPr>
+      <w:rPr>
+        <w:rFonts w:ascii="Courier New" w:hAnsi="Courier New" w:cs="Courier New" w:hint="default"/>
+      </w:rPr>
+    </w:lvl>
+    <w:lvl w:ilvl="8" w:tplc="40090005" w:tentative="1">
+      <w:start w:val="1"/>
+      <w:numFmt w:val="bullet"/>
+      <w:lvlText w:val=""/>
+      <w:lvlJc w:val="left"/>
+      <w:pPr>
+        <w:ind w:left="6480" w:hanging="360"/>
+      </w:pPr>
+      <w:rPr>
+        <w:rFonts w:ascii="Wingdings" w:hAnsi="Wingdings" w:hint="default"/>
+      </w:rPr>
+    </w:lvl>
+  </w:abstractNum>
+  <w:abstractNum w:abstractNumId="15" w15:restartNumberingAfterBreak="0">
     <w:nsid w:val="53D83FE9"/>
     <w:multiLevelType w:val="hybridMultilevel"/>
     <w:tmpl w:val="BA38772E"/>
@@ -5186,7 +5455,7 @@
       </w:rPr>
     </w:lvl>
   </w:abstractNum>
-  <w:abstractNum w:abstractNumId="12" w15:restartNumberingAfterBreak="0">
+  <w:abstractNum w:abstractNumId="16" w15:restartNumberingAfterBreak="0">
     <w:nsid w:val="58527E6B"/>
     <w:multiLevelType w:val="hybridMultilevel"/>
     <w:tmpl w:val="F69EBE42"/>
@@ -5299,7 +5568,7 @@
       </w:rPr>
     </w:lvl>
   </w:abstractNum>
-  <w:abstractNum w:abstractNumId="13" w15:restartNumberingAfterBreak="0">
+  <w:abstractNum w:abstractNumId="17" w15:restartNumberingAfterBreak="0">
     <w:nsid w:val="5C5150BB"/>
     <w:multiLevelType w:val="hybridMultilevel"/>
     <w:tmpl w:val="98DA9296"/>
@@ -5412,7 +5681,7 @@
       </w:rPr>
     </w:lvl>
   </w:abstractNum>
-  <w:abstractNum w:abstractNumId="14" w15:restartNumberingAfterBreak="0">
+  <w:abstractNum w:abstractNumId="18" w15:restartNumberingAfterBreak="0">
     <w:nsid w:val="5E436CDF"/>
     <w:multiLevelType w:val="hybridMultilevel"/>
     <w:tmpl w:val="39283E72"/>
@@ -5525,7 +5794,7 @@
       </w:rPr>
     </w:lvl>
   </w:abstractNum>
-  <w:abstractNum w:abstractNumId="15" w15:restartNumberingAfterBreak="0">
+  <w:abstractNum w:abstractNumId="19" w15:restartNumberingAfterBreak="0">
     <w:nsid w:val="62CF6AEF"/>
     <w:multiLevelType w:val="hybridMultilevel"/>
     <w:tmpl w:val="4A06157E"/>
@@ -5638,7 +5907,7 @@
       </w:rPr>
     </w:lvl>
   </w:abstractNum>
-  <w:abstractNum w:abstractNumId="16" w15:restartNumberingAfterBreak="0">
+  <w:abstractNum w:abstractNumId="20" w15:restartNumberingAfterBreak="0">
     <w:nsid w:val="79AA38CB"/>
     <w:multiLevelType w:val="hybridMultilevel"/>
     <w:tmpl w:val="7436C764"/>
@@ -5751,7 +6020,7 @@
       </w:rPr>
     </w:lvl>
   </w:abstractNum>
-  <w:abstractNum w:abstractNumId="17" w15:restartNumberingAfterBreak="0">
+  <w:abstractNum w:abstractNumId="21" w15:restartNumberingAfterBreak="0">
     <w:nsid w:val="7A240C64"/>
     <w:multiLevelType w:val="hybridMultilevel"/>
     <w:tmpl w:val="FDBC9838"/>
@@ -5865,19 +6134,19 @@
     </w:lvl>
   </w:abstractNum>
   <w:num w:numId="1" w16cid:durableId="1925917254">
-    <w:abstractNumId w:val="17"/>
+    <w:abstractNumId w:val="21"/>
   </w:num>
   <w:num w:numId="2" w16cid:durableId="46221930">
     <w:abstractNumId w:val="4"/>
   </w:num>
   <w:num w:numId="3" w16cid:durableId="1216160372">
-    <w:abstractNumId w:val="15"/>
+    <w:abstractNumId w:val="19"/>
   </w:num>
   <w:num w:numId="4" w16cid:durableId="1042442157">
-    <w:abstractNumId w:val="8"/>
+    <w:abstractNumId w:val="9"/>
   </w:num>
   <w:num w:numId="5" w16cid:durableId="30497829">
-    <w:abstractNumId w:val="11"/>
+    <w:abstractNumId w:val="15"/>
   </w:num>
   <w:num w:numId="6" w16cid:durableId="283509166">
     <w:abstractNumId w:val="5"/>
@@ -5892,31 +6161,43 @@
     <w:abstractNumId w:val="1"/>
   </w:num>
   <w:num w:numId="10" w16cid:durableId="264195309">
-    <w:abstractNumId w:val="13"/>
+    <w:abstractNumId w:val="17"/>
   </w:num>
   <w:num w:numId="11" w16cid:durableId="942955971">
-    <w:abstractNumId w:val="6"/>
+    <w:abstractNumId w:val="7"/>
   </w:num>
   <w:num w:numId="12" w16cid:durableId="669210680">
-    <w:abstractNumId w:val="9"/>
+    <w:abstractNumId w:val="12"/>
   </w:num>
   <w:num w:numId="13" w16cid:durableId="768542899">
-    <w:abstractNumId w:val="12"/>
+    <w:abstractNumId w:val="16"/>
   </w:num>
   <w:num w:numId="14" w16cid:durableId="641010424">
     <w:abstractNumId w:val="2"/>
   </w:num>
   <w:num w:numId="15" w16cid:durableId="2075738914">
-    <w:abstractNumId w:val="16"/>
+    <w:abstractNumId w:val="20"/>
   </w:num>
   <w:num w:numId="16" w16cid:durableId="1457260491">
-    <w:abstractNumId w:val="7"/>
+    <w:abstractNumId w:val="8"/>
   </w:num>
   <w:num w:numId="17" w16cid:durableId="734014231">
+    <w:abstractNumId w:val="13"/>
+  </w:num>
+  <w:num w:numId="18" w16cid:durableId="1907061244">
+    <w:abstractNumId w:val="18"/>
+  </w:num>
+  <w:num w:numId="19" w16cid:durableId="1487432366">
+    <w:abstractNumId w:val="14"/>
+  </w:num>
+  <w:num w:numId="20" w16cid:durableId="1945263381">
+    <w:abstractNumId w:val="11"/>
+  </w:num>
+  <w:num w:numId="21" w16cid:durableId="344329721">
     <w:abstractNumId w:val="10"/>
   </w:num>
-  <w:num w:numId="18" w16cid:durableId="1907061244">
-    <w:abstractNumId w:val="14"/>
+  <w:num w:numId="22" w16cid:durableId="99184748">
+    <w:abstractNumId w:val="6"/>
   </w:num>
 </w:numbering>
 </file>
@@ -6524,6 +6805,7 @@
   <w:style w:type="character" w:default="1" w:styleId="DefaultParagraphFont">
     <w:name w:val="Default Paragraph Font"/>
     <w:uiPriority w:val="1"/>
+    <w:semiHidden/>
     <w:unhideWhenUsed/>
   </w:style>
   <w:style w:type="table" w:default="1" w:styleId="TableNormal">

</xml_diff>